<commit_message>
fix typo in CV
</commit_message>
<xml_diff>
--- a/files/CV-Marc_Klinger_02-2025.docx
+++ b/files/CV-Marc_Klinger_02-2025.docx
@@ -429,27 +429,7 @@
                                             <w:color w:val="000000" w:themeColor="text1"/>
                                             <w:sz w:val="20"/>
                                           </w:rPr>
-                                          <w:t xml:space="preserve">PhD in Theoretical </w:t>
-                                        </w:r>
-                                        <w:proofErr w:type="spellStart"/>
-                                        <w:r>
-                                          <w:rPr>
-                                            <w:rFonts w:ascii="Trebuchet MS" w:hAnsi="Trebuchet MS"/>
-                                            <w:b/>
-                                            <w:color w:val="000000" w:themeColor="text1"/>
-                                            <w:sz w:val="20"/>
-                                          </w:rPr>
-                                          <w:t>Astroparticle</w:t>
-                                        </w:r>
-                                        <w:proofErr w:type="spellEnd"/>
-                                        <w:r>
-                                          <w:rPr>
-                                            <w:rFonts w:ascii="Trebuchet MS" w:hAnsi="Trebuchet MS"/>
-                                            <w:b/>
-                                            <w:color w:val="000000" w:themeColor="text1"/>
-                                            <w:sz w:val="20"/>
-                                          </w:rPr>
-                                          <w:t xml:space="preserve"> Physics </w:t>
+                                          <w:t xml:space="preserve">PhD in Theoretical Astroparticle Physics </w:t>
                                         </w:r>
                                         <w:r>
                                           <w:rPr>
@@ -492,25 +472,7 @@
                                             <w:color w:val="000000" w:themeColor="text1"/>
                                             <w:sz w:val="20"/>
                                           </w:rPr>
-                                          <w:t xml:space="preserve">DESY </w:t>
-                                        </w:r>
-                                        <w:proofErr w:type="spellStart"/>
-                                        <w:r>
-                                          <w:rPr>
-                                            <w:rFonts w:ascii="Trebuchet MS" w:hAnsi="Trebuchet MS"/>
-                                            <w:color w:val="000000" w:themeColor="text1"/>
-                                            <w:sz w:val="20"/>
-                                          </w:rPr>
-                                          <w:t>Zeuthen</w:t>
-                                        </w:r>
-                                        <w:proofErr w:type="spellEnd"/>
-                                        <w:r>
-                                          <w:rPr>
-                                            <w:rFonts w:ascii="Trebuchet MS" w:hAnsi="Trebuchet MS"/>
-                                            <w:color w:val="000000" w:themeColor="text1"/>
-                                            <w:sz w:val="20"/>
-                                          </w:rPr>
-                                          <w:t xml:space="preserve"> </w:t>
+                                          <w:t xml:space="preserve">DESY Zeuthen </w:t>
                                         </w:r>
                                       </w:p>
                                       <w:p>
@@ -552,25 +514,7 @@
                                               <w:rFonts w:ascii="Trebuchet MS" w:hAnsi="Trebuchet MS"/>
                                               <w:sz w:val="20"/>
                                             </w:rPr>
-                                            <w:t xml:space="preserve">Helmholtz Weizmann Research School on </w:t>
-                                          </w:r>
-                                          <w:proofErr w:type="spellStart"/>
-                                          <w:r>
-                                            <w:rPr>
-                                              <w:rStyle w:val="Hyperlink"/>
-                                              <w:rFonts w:ascii="Trebuchet MS" w:hAnsi="Trebuchet MS"/>
-                                              <w:sz w:val="20"/>
-                                            </w:rPr>
-                                            <w:t>Multimessenger</w:t>
-                                          </w:r>
-                                          <w:proofErr w:type="spellEnd"/>
-                                          <w:r>
-                                            <w:rPr>
-                                              <w:rStyle w:val="Hyperlink"/>
-                                              <w:rFonts w:ascii="Trebuchet MS" w:hAnsi="Trebuchet MS"/>
-                                              <w:sz w:val="20"/>
-                                            </w:rPr>
-                                            <w:t xml:space="preserve"> Astronomy</w:t>
+                                            <w:t>Helmholtz Weizmann Research School on Multimessenger Astronomy</w:t>
                                           </w:r>
                                         </w:hyperlink>
                                       </w:p>
@@ -883,27 +827,7 @@
                                       <w:color w:val="000000" w:themeColor="text1"/>
                                       <w:sz w:val="20"/>
                                     </w:rPr>
-                                    <w:t xml:space="preserve">PhD in Theoretical </w:t>
-                                  </w:r>
-                                  <w:proofErr w:type="spellStart"/>
-                                  <w:r>
-                                    <w:rPr>
-                                      <w:rFonts w:ascii="Trebuchet MS" w:hAnsi="Trebuchet MS"/>
-                                      <w:b/>
-                                      <w:color w:val="000000" w:themeColor="text1"/>
-                                      <w:sz w:val="20"/>
-                                    </w:rPr>
-                                    <w:t>Astroparticle</w:t>
-                                  </w:r>
-                                  <w:proofErr w:type="spellEnd"/>
-                                  <w:r>
-                                    <w:rPr>
-                                      <w:rFonts w:ascii="Trebuchet MS" w:hAnsi="Trebuchet MS"/>
-                                      <w:b/>
-                                      <w:color w:val="000000" w:themeColor="text1"/>
-                                      <w:sz w:val="20"/>
-                                    </w:rPr>
-                                    <w:t xml:space="preserve"> Physics </w:t>
+                                    <w:t xml:space="preserve">PhD in Theoretical Astroparticle Physics </w:t>
                                   </w:r>
                                   <w:r>
                                     <w:rPr>
@@ -946,25 +870,7 @@
                                       <w:color w:val="000000" w:themeColor="text1"/>
                                       <w:sz w:val="20"/>
                                     </w:rPr>
-                                    <w:t xml:space="preserve">DESY </w:t>
-                                  </w:r>
-                                  <w:proofErr w:type="spellStart"/>
-                                  <w:r>
-                                    <w:rPr>
-                                      <w:rFonts w:ascii="Trebuchet MS" w:hAnsi="Trebuchet MS"/>
-                                      <w:color w:val="000000" w:themeColor="text1"/>
-                                      <w:sz w:val="20"/>
-                                    </w:rPr>
-                                    <w:t>Zeuthen</w:t>
-                                  </w:r>
-                                  <w:proofErr w:type="spellEnd"/>
-                                  <w:r>
-                                    <w:rPr>
-                                      <w:rFonts w:ascii="Trebuchet MS" w:hAnsi="Trebuchet MS"/>
-                                      <w:color w:val="000000" w:themeColor="text1"/>
-                                      <w:sz w:val="20"/>
-                                    </w:rPr>
-                                    <w:t xml:space="preserve"> </w:t>
+                                    <w:t xml:space="preserve">DESY Zeuthen </w:t>
                                   </w:r>
                                 </w:p>
                                 <w:p>
@@ -1006,25 +912,7 @@
                                         <w:rFonts w:ascii="Trebuchet MS" w:hAnsi="Trebuchet MS"/>
                                         <w:sz w:val="20"/>
                                       </w:rPr>
-                                      <w:t xml:space="preserve">Helmholtz Weizmann Research School on </w:t>
-                                    </w:r>
-                                    <w:proofErr w:type="spellStart"/>
-                                    <w:r>
-                                      <w:rPr>
-                                        <w:rStyle w:val="Hyperlink"/>
-                                        <w:rFonts w:ascii="Trebuchet MS" w:hAnsi="Trebuchet MS"/>
-                                        <w:sz w:val="20"/>
-                                      </w:rPr>
-                                      <w:t>Multimessenger</w:t>
-                                    </w:r>
-                                    <w:proofErr w:type="spellEnd"/>
-                                    <w:r>
-                                      <w:rPr>
-                                        <w:rStyle w:val="Hyperlink"/>
-                                        <w:rFonts w:ascii="Trebuchet MS" w:hAnsi="Trebuchet MS"/>
-                                        <w:sz w:val="20"/>
-                                      </w:rPr>
-                                      <w:t xml:space="preserve"> Astronomy</w:t>
+                                      <w:t>Helmholtz Weizmann Research School on Multimessenger Astronomy</w:t>
                                     </w:r>
                                   </w:hyperlink>
                                 </w:p>
@@ -1437,23 +1325,13 @@
                                           </w:rPr>
                                           <w:t xml:space="preserve">Focus: </w:t>
                                         </w:r>
-                                        <w:proofErr w:type="spellStart"/>
-                                        <w:r>
-                                          <w:rPr>
-                                            <w:rFonts w:ascii="Trebuchet MS" w:hAnsi="Trebuchet MS"/>
-                                            <w:color w:val="000000" w:themeColor="text1"/>
-                                            <w:sz w:val="20"/>
-                                          </w:rPr>
-                                          <w:t>Astroparticle</w:t>
-                                        </w:r>
-                                        <w:proofErr w:type="spellEnd"/>
-                                        <w:r>
-                                          <w:rPr>
-                                            <w:rFonts w:ascii="Trebuchet MS" w:hAnsi="Trebuchet MS"/>
-                                            <w:color w:val="000000" w:themeColor="text1"/>
-                                            <w:sz w:val="20"/>
-                                          </w:rPr>
-                                          <w:t xml:space="preserve"> Physics and Cosmology</w:t>
+                                        <w:r>
+                                          <w:rPr>
+                                            <w:rFonts w:ascii="Trebuchet MS" w:hAnsi="Trebuchet MS"/>
+                                            <w:color w:val="000000" w:themeColor="text1"/>
+                                            <w:sz w:val="20"/>
+                                          </w:rPr>
+                                          <w:t>Astroparticle Physics and Cosmology</w:t>
                                         </w:r>
                                       </w:p>
                                       <w:p>
@@ -1497,18 +1375,8 @@
                                             <w:color w:val="000000" w:themeColor="text1"/>
                                             <w:sz w:val="20"/>
                                           </w:rPr>
-                                          <w:t xml:space="preserve"> Thomas Bretz, Philipp </w:t>
-                                        </w:r>
-                                        <w:proofErr w:type="spellStart"/>
-                                        <w:r>
-                                          <w:rPr>
-                                            <w:rFonts w:ascii="Trebuchet MS" w:hAnsi="Trebuchet MS"/>
-                                            <w:color w:val="000000" w:themeColor="text1"/>
-                                            <w:sz w:val="20"/>
-                                          </w:rPr>
-                                          <w:t>Mertsch</w:t>
-                                        </w:r>
-                                        <w:proofErr w:type="spellEnd"/>
+                                          <w:t xml:space="preserve"> Thomas Bretz, Philipp Mertsch</w:t>
+                                        </w:r>
                                       </w:p>
                                       <w:p>
                                         <w:pPr>
@@ -1719,23 +1587,13 @@
                                     </w:rPr>
                                     <w:t xml:space="preserve">Focus: </w:t>
                                   </w:r>
-                                  <w:proofErr w:type="spellStart"/>
-                                  <w:r>
-                                    <w:rPr>
-                                      <w:rFonts w:ascii="Trebuchet MS" w:hAnsi="Trebuchet MS"/>
-                                      <w:color w:val="000000" w:themeColor="text1"/>
-                                      <w:sz w:val="20"/>
-                                    </w:rPr>
-                                    <w:t>Astroparticle</w:t>
-                                  </w:r>
-                                  <w:proofErr w:type="spellEnd"/>
-                                  <w:r>
-                                    <w:rPr>
-                                      <w:rFonts w:ascii="Trebuchet MS" w:hAnsi="Trebuchet MS"/>
-                                      <w:color w:val="000000" w:themeColor="text1"/>
-                                      <w:sz w:val="20"/>
-                                    </w:rPr>
-                                    <w:t xml:space="preserve"> Physics and Cosmology</w:t>
+                                  <w:r>
+                                    <w:rPr>
+                                      <w:rFonts w:ascii="Trebuchet MS" w:hAnsi="Trebuchet MS"/>
+                                      <w:color w:val="000000" w:themeColor="text1"/>
+                                      <w:sz w:val="20"/>
+                                    </w:rPr>
+                                    <w:t>Astroparticle Physics and Cosmology</w:t>
                                   </w:r>
                                 </w:p>
                                 <w:p>
@@ -1779,18 +1637,8 @@
                                       <w:color w:val="000000" w:themeColor="text1"/>
                                       <w:sz w:val="20"/>
                                     </w:rPr>
-                                    <w:t xml:space="preserve"> Thomas Bretz, Philipp </w:t>
-                                  </w:r>
-                                  <w:proofErr w:type="spellStart"/>
-                                  <w:r>
-                                    <w:rPr>
-                                      <w:rFonts w:ascii="Trebuchet MS" w:hAnsi="Trebuchet MS"/>
-                                      <w:color w:val="000000" w:themeColor="text1"/>
-                                      <w:sz w:val="20"/>
-                                    </w:rPr>
-                                    <w:t>Mertsch</w:t>
-                                  </w:r>
-                                  <w:proofErr w:type="spellEnd"/>
+                                    <w:t xml:space="preserve"> Thomas Bretz, Philipp Mertsch</w:t>
+                                  </w:r>
                                 </w:p>
                                 <w:p>
                                   <w:pPr>
@@ -2089,18 +1937,8 @@
                                             <w:color w:val="000000" w:themeColor="text1"/>
                                             <w:sz w:val="20"/>
                                           </w:rPr>
-                                          <w:t xml:space="preserve">Christopher </w:t>
-                                        </w:r>
-                                        <w:proofErr w:type="spellStart"/>
-                                        <w:r>
-                                          <w:rPr>
-                                            <w:rFonts w:ascii="Trebuchet MS" w:hAnsi="Trebuchet MS"/>
-                                            <w:color w:val="000000" w:themeColor="text1"/>
-                                            <w:sz w:val="20"/>
-                                          </w:rPr>
-                                          <w:t>Wiebusch</w:t>
-                                        </w:r>
-                                        <w:proofErr w:type="spellEnd"/>
+                                          <w:t>Christopher Wiebusch</w:t>
+                                        </w:r>
                                         <w:r>
                                           <w:rPr>
                                             <w:rFonts w:ascii="Trebuchet MS" w:hAnsi="Trebuchet MS"/>
@@ -2153,27 +1991,7 @@
                                             <w:color w:val="000000" w:themeColor="text1"/>
                                             <w:sz w:val="20"/>
                                           </w:rPr>
-                                          <w:t xml:space="preserve">acoustic emitters for the </w:t>
-                                        </w:r>
-                                        <w:proofErr w:type="spellStart"/>
-                                        <w:r>
-                                          <w:rPr>
-                                            <w:rFonts w:ascii="Trebuchet MS" w:hAnsi="Trebuchet MS"/>
-                                            <w:i/>
-                                            <w:color w:val="000000" w:themeColor="text1"/>
-                                            <w:sz w:val="20"/>
-                                          </w:rPr>
-                                          <w:t>EnEx</w:t>
-                                        </w:r>
-                                        <w:proofErr w:type="spellEnd"/>
-                                        <w:r>
-                                          <w:rPr>
-                                            <w:rFonts w:ascii="Trebuchet MS" w:hAnsi="Trebuchet MS"/>
-                                            <w:i/>
-                                            <w:color w:val="000000" w:themeColor="text1"/>
-                                            <w:sz w:val="20"/>
-                                          </w:rPr>
-                                          <w:t>-RANGE project</w:t>
+                                          <w:t>acoustic emitters for the EnEx-RANGE project</w:t>
                                         </w:r>
                                         <w:r>
                                           <w:rPr>
@@ -2362,18 +2180,8 @@
                                       <w:color w:val="000000" w:themeColor="text1"/>
                                       <w:sz w:val="20"/>
                                     </w:rPr>
-                                    <w:t xml:space="preserve">Christopher </w:t>
-                                  </w:r>
-                                  <w:proofErr w:type="spellStart"/>
-                                  <w:r>
-                                    <w:rPr>
-                                      <w:rFonts w:ascii="Trebuchet MS" w:hAnsi="Trebuchet MS"/>
-                                      <w:color w:val="000000" w:themeColor="text1"/>
-                                      <w:sz w:val="20"/>
-                                    </w:rPr>
-                                    <w:t>Wiebusch</w:t>
-                                  </w:r>
-                                  <w:proofErr w:type="spellEnd"/>
+                                    <w:t>Christopher Wiebusch</w:t>
+                                  </w:r>
                                   <w:r>
                                     <w:rPr>
                                       <w:rFonts w:ascii="Trebuchet MS" w:hAnsi="Trebuchet MS"/>
@@ -2426,27 +2234,7 @@
                                       <w:color w:val="000000" w:themeColor="text1"/>
                                       <w:sz w:val="20"/>
                                     </w:rPr>
-                                    <w:t xml:space="preserve">acoustic emitters for the </w:t>
-                                  </w:r>
-                                  <w:proofErr w:type="spellStart"/>
-                                  <w:r>
-                                    <w:rPr>
-                                      <w:rFonts w:ascii="Trebuchet MS" w:hAnsi="Trebuchet MS"/>
-                                      <w:i/>
-                                      <w:color w:val="000000" w:themeColor="text1"/>
-                                      <w:sz w:val="20"/>
-                                    </w:rPr>
-                                    <w:t>EnEx</w:t>
-                                  </w:r>
-                                  <w:proofErr w:type="spellEnd"/>
-                                  <w:r>
-                                    <w:rPr>
-                                      <w:rFonts w:ascii="Trebuchet MS" w:hAnsi="Trebuchet MS"/>
-                                      <w:i/>
-                                      <w:color w:val="000000" w:themeColor="text1"/>
-                                      <w:sz w:val="20"/>
-                                    </w:rPr>
-                                    <w:t>-RANGE project</w:t>
+                                    <w:t>acoustic emitters for the EnEx-RANGE project</w:t>
                                   </w:r>
                                   <w:r>
                                     <w:rPr>
@@ -3147,27 +2935,7 @@
                                             <w:color w:val="000000" w:themeColor="text1"/>
                                             <w:sz w:val="20"/>
                                           </w:rPr>
-                                          <w:t xml:space="preserve">, </w:t>
-                                        </w:r>
-                                        <w:proofErr w:type="spellStart"/>
-                                        <w:r>
-                                          <w:rPr>
-                                            <w:rFonts w:ascii="Trebuchet MS" w:hAnsi="Trebuchet MS"/>
-                                            <w:b/>
-                                            <w:color w:val="000000" w:themeColor="text1"/>
-                                            <w:sz w:val="20"/>
-                                          </w:rPr>
-                                          <w:t>Varenna</w:t>
-                                        </w:r>
-                                        <w:proofErr w:type="spellEnd"/>
-                                        <w:r>
-                                          <w:rPr>
-                                            <w:rFonts w:ascii="Trebuchet MS" w:hAnsi="Trebuchet MS"/>
-                                            <w:b/>
-                                            <w:color w:val="000000" w:themeColor="text1"/>
-                                            <w:sz w:val="20"/>
-                                          </w:rPr>
-                                          <w:t xml:space="preserve"> (Italy)</w:t>
+                                          <w:t>, Varenna (Italy)</w:t>
                                         </w:r>
                                       </w:p>
                                       <w:p>
@@ -3308,27 +3076,7 @@
                                       <w:color w:val="000000" w:themeColor="text1"/>
                                       <w:sz w:val="20"/>
                                     </w:rPr>
-                                    <w:t xml:space="preserve">, </w:t>
-                                  </w:r>
-                                  <w:proofErr w:type="spellStart"/>
-                                  <w:r>
-                                    <w:rPr>
-                                      <w:rFonts w:ascii="Trebuchet MS" w:hAnsi="Trebuchet MS"/>
-                                      <w:b/>
-                                      <w:color w:val="000000" w:themeColor="text1"/>
-                                      <w:sz w:val="20"/>
-                                    </w:rPr>
-                                    <w:t>Varenna</w:t>
-                                  </w:r>
-                                  <w:proofErr w:type="spellEnd"/>
-                                  <w:r>
-                                    <w:rPr>
-                                      <w:rFonts w:ascii="Trebuchet MS" w:hAnsi="Trebuchet MS"/>
-                                      <w:b/>
-                                      <w:color w:val="000000" w:themeColor="text1"/>
-                                      <w:sz w:val="20"/>
-                                    </w:rPr>
-                                    <w:t xml:space="preserve"> (Italy)</w:t>
+                                    <w:t>, Varenna (Italy)</w:t>
                                   </w:r>
                                 </w:p>
                                 <w:p>
@@ -3508,27 +3256,7 @@
                                             <w:color w:val="000000" w:themeColor="text1"/>
                                             <w:sz w:val="20"/>
                                           </w:rPr>
-                                          <w:t xml:space="preserve">Assistant Scientist at </w:t>
-                                        </w:r>
-                                        <w:proofErr w:type="spellStart"/>
-                                        <w:r>
-                                          <w:rPr>
-                                            <w:rFonts w:ascii="Trebuchet MS" w:hAnsi="Trebuchet MS"/>
-                                            <w:b/>
-                                            <w:color w:val="000000" w:themeColor="text1"/>
-                                            <w:sz w:val="20"/>
-                                          </w:rPr>
-                                          <w:t>EnEx</w:t>
-                                        </w:r>
-                                        <w:proofErr w:type="spellEnd"/>
-                                        <w:r>
-                                          <w:rPr>
-                                            <w:rFonts w:ascii="Trebuchet MS" w:hAnsi="Trebuchet MS"/>
-                                            <w:b/>
-                                            <w:color w:val="000000" w:themeColor="text1"/>
-                                            <w:sz w:val="20"/>
-                                          </w:rPr>
-                                          <w:t xml:space="preserve"> RANGE Project at RWTH Aachen</w:t>
+                                          <w:t>Assistant Scientist at EnEx RANGE Project at RWTH Aachen</w:t>
                                         </w:r>
                                       </w:p>
                                       <w:p>
@@ -3675,27 +3403,7 @@
                                       <w:color w:val="000000" w:themeColor="text1"/>
                                       <w:sz w:val="20"/>
                                     </w:rPr>
-                                    <w:t xml:space="preserve">Assistant Scientist at </w:t>
-                                  </w:r>
-                                  <w:proofErr w:type="spellStart"/>
-                                  <w:r>
-                                    <w:rPr>
-                                      <w:rFonts w:ascii="Trebuchet MS" w:hAnsi="Trebuchet MS"/>
-                                      <w:b/>
-                                      <w:color w:val="000000" w:themeColor="text1"/>
-                                      <w:sz w:val="20"/>
-                                    </w:rPr>
-                                    <w:t>EnEx</w:t>
-                                  </w:r>
-                                  <w:proofErr w:type="spellEnd"/>
-                                  <w:r>
-                                    <w:rPr>
-                                      <w:rFonts w:ascii="Trebuchet MS" w:hAnsi="Trebuchet MS"/>
-                                      <w:b/>
-                                      <w:color w:val="000000" w:themeColor="text1"/>
-                                      <w:sz w:val="20"/>
-                                    </w:rPr>
-                                    <w:t xml:space="preserve"> RANGE Project at RWTH Aachen</w:t>
+                                    <w:t>Assistant Scientist at EnEx RANGE Project at RWTH Aachen</w:t>
                                   </w:r>
                                 </w:p>
                                 <w:p>
@@ -5040,29 +4748,7 @@
                                             <w:sz w:val="20"/>
                                             <w:lang w:val="en-US"/>
                                           </w:rPr>
-                                          <w:t>DPG-</w:t>
-                                        </w:r>
-                                        <w:proofErr w:type="spellStart"/>
-                                        <w:r>
-                                          <w:rPr>
-                                            <w:rFonts w:ascii="Trebuchet MS" w:hAnsi="Trebuchet MS"/>
-                                            <w:b/>
-                                            <w:color w:val="000000" w:themeColor="text1"/>
-                                            <w:sz w:val="20"/>
-                                            <w:lang w:val="en-US"/>
-                                          </w:rPr>
-                                          <w:t>Abiturpreis</w:t>
-                                        </w:r>
-                                        <w:proofErr w:type="spellEnd"/>
-                                        <w:r>
-                                          <w:rPr>
-                                            <w:rFonts w:ascii="Trebuchet MS" w:hAnsi="Trebuchet MS"/>
-                                            <w:b/>
-                                            <w:color w:val="000000" w:themeColor="text1"/>
-                                            <w:sz w:val="20"/>
-                                            <w:lang w:val="en-US"/>
-                                          </w:rPr>
-                                          <w:t xml:space="preserve"> Physics – </w:t>
+                                          <w:t xml:space="preserve">DPG-Abiturpreis Physics – </w:t>
                                         </w:r>
                                         <w:r>
                                           <w:rPr>
@@ -5244,29 +4930,7 @@
                                       <w:sz w:val="20"/>
                                       <w:lang w:val="en-US"/>
                                     </w:rPr>
-                                    <w:t>DPG-</w:t>
-                                  </w:r>
-                                  <w:proofErr w:type="spellStart"/>
-                                  <w:r>
-                                    <w:rPr>
-                                      <w:rFonts w:ascii="Trebuchet MS" w:hAnsi="Trebuchet MS"/>
-                                      <w:b/>
-                                      <w:color w:val="000000" w:themeColor="text1"/>
-                                      <w:sz w:val="20"/>
-                                      <w:lang w:val="en-US"/>
-                                    </w:rPr>
-                                    <w:t>Abiturpreis</w:t>
-                                  </w:r>
-                                  <w:proofErr w:type="spellEnd"/>
-                                  <w:r>
-                                    <w:rPr>
-                                      <w:rFonts w:ascii="Trebuchet MS" w:hAnsi="Trebuchet MS"/>
-                                      <w:b/>
-                                      <w:color w:val="000000" w:themeColor="text1"/>
-                                      <w:sz w:val="20"/>
-                                      <w:lang w:val="en-US"/>
-                                    </w:rPr>
-                                    <w:t xml:space="preserve"> Physics – </w:t>
+                                    <w:t xml:space="preserve">DPG-Abiturpreis Physics – </w:t>
                                   </w:r>
                                   <w:r>
                                     <w:rPr>
@@ -6932,27 +6596,7 @@
                                             <w:color w:val="000000" w:themeColor="text1"/>
                                             <w:sz w:val="20"/>
                                           </w:rPr>
-                                          <w:t xml:space="preserve">AIS³ – </w:t>
-                                        </w:r>
-                                        <w:proofErr w:type="spellStart"/>
-                                        <w:r>
-                                          <w:rPr>
-                                            <w:rFonts w:ascii="Trebuchet MS" w:hAnsi="Trebuchet MS"/>
-                                            <w:b/>
-                                            <w:color w:val="000000" w:themeColor="text1"/>
-                                            <w:sz w:val="20"/>
-                                          </w:rPr>
-                                          <w:t>Astroparticle</w:t>
-                                        </w:r>
-                                        <w:proofErr w:type="spellEnd"/>
-                                        <w:r>
-                                          <w:rPr>
-                                            <w:rFonts w:ascii="Trebuchet MS" w:hAnsi="Trebuchet MS"/>
-                                            <w:b/>
-                                            <w:color w:val="000000" w:themeColor="text1"/>
-                                            <w:sz w:val="20"/>
-                                          </w:rPr>
-                                          <w:t xml:space="preserve"> Immersive Synthesizer³</w:t>
+                                          <w:t>AIS³ – Astroparticle Immersive Synthesizer³</w:t>
                                         </w:r>
                                       </w:p>
                                       <w:p>
@@ -7091,27 +6735,7 @@
                                       <w:color w:val="000000" w:themeColor="text1"/>
                                       <w:sz w:val="20"/>
                                     </w:rPr>
-                                    <w:t xml:space="preserve">AIS³ – </w:t>
-                                  </w:r>
-                                  <w:proofErr w:type="spellStart"/>
-                                  <w:r>
-                                    <w:rPr>
-                                      <w:rFonts w:ascii="Trebuchet MS" w:hAnsi="Trebuchet MS"/>
-                                      <w:b/>
-                                      <w:color w:val="000000" w:themeColor="text1"/>
-                                      <w:sz w:val="20"/>
-                                    </w:rPr>
-                                    <w:t>Astroparticle</w:t>
-                                  </w:r>
-                                  <w:proofErr w:type="spellEnd"/>
-                                  <w:r>
-                                    <w:rPr>
-                                      <w:rFonts w:ascii="Trebuchet MS" w:hAnsi="Trebuchet MS"/>
-                                      <w:b/>
-                                      <w:color w:val="000000" w:themeColor="text1"/>
-                                      <w:sz w:val="20"/>
-                                    </w:rPr>
-                                    <w:t xml:space="preserve"> Immersive Synthesizer³</w:t>
+                                    <w:t>AIS³ – Astroparticle Immersive Synthesizer³</w:t>
                                   </w:r>
                                 </w:p>
                                 <w:p>
@@ -9172,27 +8796,7 @@
                                             <w:color w:val="000000" w:themeColor="text1"/>
                                             <w:sz w:val="20"/>
                                           </w:rPr>
-                                          <w:t>Support of a Spanish exchange student in Aachen (</w:t>
-                                        </w:r>
-                                        <w:proofErr w:type="spellStart"/>
-                                        <w:r>
-                                          <w:rPr>
-                                            <w:rFonts w:ascii="Trebuchet MS" w:hAnsi="Trebuchet MS"/>
-                                            <w:b/>
-                                            <w:color w:val="000000" w:themeColor="text1"/>
-                                            <w:sz w:val="20"/>
-                                          </w:rPr>
-                                          <w:t>BeBuddy</w:t>
-                                        </w:r>
-                                        <w:proofErr w:type="spellEnd"/>
-                                        <w:r>
-                                          <w:rPr>
-                                            <w:rFonts w:ascii="Trebuchet MS" w:hAnsi="Trebuchet MS"/>
-                                            <w:b/>
-                                            <w:color w:val="000000" w:themeColor="text1"/>
-                                            <w:sz w:val="20"/>
-                                          </w:rPr>
-                                          <w:t>)</w:t>
+                                          <w:t>Support of a Spanish exchange student in Aachen (BeBuddy)</w:t>
                                         </w:r>
                                       </w:p>
                                     </w:tc>
@@ -9295,27 +8899,7 @@
                                       <w:color w:val="000000" w:themeColor="text1"/>
                                       <w:sz w:val="20"/>
                                     </w:rPr>
-                                    <w:t>Support of a Spanish exchange student in Aachen (</w:t>
-                                  </w:r>
-                                  <w:proofErr w:type="spellStart"/>
-                                  <w:r>
-                                    <w:rPr>
-                                      <w:rFonts w:ascii="Trebuchet MS" w:hAnsi="Trebuchet MS"/>
-                                      <w:b/>
-                                      <w:color w:val="000000" w:themeColor="text1"/>
-                                      <w:sz w:val="20"/>
-                                    </w:rPr>
-                                    <w:t>BeBuddy</w:t>
-                                  </w:r>
-                                  <w:proofErr w:type="spellEnd"/>
-                                  <w:r>
-                                    <w:rPr>
-                                      <w:rFonts w:ascii="Trebuchet MS" w:hAnsi="Trebuchet MS"/>
-                                      <w:b/>
-                                      <w:color w:val="000000" w:themeColor="text1"/>
-                                      <w:sz w:val="20"/>
-                                    </w:rPr>
-                                    <w:t>)</w:t>
+                                    <w:t>Support of a Spanish exchange student in Aachen (BeBuddy)</w:t>
                                   </w:r>
                                 </w:p>
                               </w:tc>
@@ -9492,7 +9076,6 @@
                                             <w:lang w:val="de-DE"/>
                                           </w:rPr>
                                         </w:pPr>
-                                        <w:proofErr w:type="spellStart"/>
                                         <w:r>
                                           <w:rPr>
                                             <w:rFonts w:ascii="Trebuchet MS" w:hAnsi="Trebuchet MS"/>
@@ -9501,62 +9084,7 @@
                                             <w:sz w:val="20"/>
                                             <w:lang w:val="de-DE"/>
                                           </w:rPr>
-                                          <w:t>Intercultural</w:t>
-                                        </w:r>
-                                        <w:proofErr w:type="spellEnd"/>
-                                        <w:r>
-                                          <w:rPr>
-                                            <w:rFonts w:ascii="Trebuchet MS" w:hAnsi="Trebuchet MS"/>
-                                            <w:b/>
-                                            <w:color w:val="000000" w:themeColor="text1"/>
-                                            <w:sz w:val="20"/>
-                                            <w:lang w:val="de-DE"/>
-                                          </w:rPr>
-                                          <w:t xml:space="preserve"> </w:t>
-                                        </w:r>
-                                        <w:proofErr w:type="spellStart"/>
-                                        <w:r>
-                                          <w:rPr>
-                                            <w:rFonts w:ascii="Trebuchet MS" w:hAnsi="Trebuchet MS"/>
-                                            <w:b/>
-                                            <w:color w:val="000000" w:themeColor="text1"/>
-                                            <w:sz w:val="20"/>
-                                            <w:lang w:val="de-DE"/>
-                                          </w:rPr>
-                                          <w:t>training</w:t>
-                                        </w:r>
-                                        <w:proofErr w:type="spellEnd"/>
-                                        <w:r>
-                                          <w:rPr>
-                                            <w:rFonts w:ascii="Trebuchet MS" w:hAnsi="Trebuchet MS"/>
-                                            <w:b/>
-                                            <w:color w:val="000000" w:themeColor="text1"/>
-                                            <w:sz w:val="20"/>
-                                            <w:lang w:val="de-DE"/>
-                                          </w:rPr>
-                                          <w:t xml:space="preserve"> (2 </w:t>
-                                        </w:r>
-                                        <w:proofErr w:type="spellStart"/>
-                                        <w:r>
-                                          <w:rPr>
-                                            <w:rFonts w:ascii="Trebuchet MS" w:hAnsi="Trebuchet MS"/>
-                                            <w:b/>
-                                            <w:color w:val="000000" w:themeColor="text1"/>
-                                            <w:sz w:val="20"/>
-                                            <w:lang w:val="de-DE"/>
-                                          </w:rPr>
-                                          <w:t>days</w:t>
-                                        </w:r>
-                                        <w:proofErr w:type="spellEnd"/>
-                                        <w:r>
-                                          <w:rPr>
-                                            <w:rFonts w:ascii="Trebuchet MS" w:hAnsi="Trebuchet MS"/>
-                                            <w:b/>
-                                            <w:color w:val="000000" w:themeColor="text1"/>
-                                            <w:sz w:val="20"/>
-                                            <w:lang w:val="de-DE"/>
-                                          </w:rPr>
-                                          <w:t>)</w:t>
+                                          <w:t>Intercultural training (2 days)</w:t>
                                         </w:r>
                                       </w:p>
                                     </w:tc>
@@ -9654,7 +9182,6 @@
                                       <w:lang w:val="de-DE"/>
                                     </w:rPr>
                                   </w:pPr>
-                                  <w:proofErr w:type="spellStart"/>
                                   <w:r>
                                     <w:rPr>
                                       <w:rFonts w:ascii="Trebuchet MS" w:hAnsi="Trebuchet MS"/>
@@ -9663,62 +9190,7 @@
                                       <w:sz w:val="20"/>
                                       <w:lang w:val="de-DE"/>
                                     </w:rPr>
-                                    <w:t>Intercultural</w:t>
-                                  </w:r>
-                                  <w:proofErr w:type="spellEnd"/>
-                                  <w:r>
-                                    <w:rPr>
-                                      <w:rFonts w:ascii="Trebuchet MS" w:hAnsi="Trebuchet MS"/>
-                                      <w:b/>
-                                      <w:color w:val="000000" w:themeColor="text1"/>
-                                      <w:sz w:val="20"/>
-                                      <w:lang w:val="de-DE"/>
-                                    </w:rPr>
-                                    <w:t xml:space="preserve"> </w:t>
-                                  </w:r>
-                                  <w:proofErr w:type="spellStart"/>
-                                  <w:r>
-                                    <w:rPr>
-                                      <w:rFonts w:ascii="Trebuchet MS" w:hAnsi="Trebuchet MS"/>
-                                      <w:b/>
-                                      <w:color w:val="000000" w:themeColor="text1"/>
-                                      <w:sz w:val="20"/>
-                                      <w:lang w:val="de-DE"/>
-                                    </w:rPr>
-                                    <w:t>training</w:t>
-                                  </w:r>
-                                  <w:proofErr w:type="spellEnd"/>
-                                  <w:r>
-                                    <w:rPr>
-                                      <w:rFonts w:ascii="Trebuchet MS" w:hAnsi="Trebuchet MS"/>
-                                      <w:b/>
-                                      <w:color w:val="000000" w:themeColor="text1"/>
-                                      <w:sz w:val="20"/>
-                                      <w:lang w:val="de-DE"/>
-                                    </w:rPr>
-                                    <w:t xml:space="preserve"> (2 </w:t>
-                                  </w:r>
-                                  <w:proofErr w:type="spellStart"/>
-                                  <w:r>
-                                    <w:rPr>
-                                      <w:rFonts w:ascii="Trebuchet MS" w:hAnsi="Trebuchet MS"/>
-                                      <w:b/>
-                                      <w:color w:val="000000" w:themeColor="text1"/>
-                                      <w:sz w:val="20"/>
-                                      <w:lang w:val="de-DE"/>
-                                    </w:rPr>
-                                    <w:t>days</w:t>
-                                  </w:r>
-                                  <w:proofErr w:type="spellEnd"/>
-                                  <w:r>
-                                    <w:rPr>
-                                      <w:rFonts w:ascii="Trebuchet MS" w:hAnsi="Trebuchet MS"/>
-                                      <w:b/>
-                                      <w:color w:val="000000" w:themeColor="text1"/>
-                                      <w:sz w:val="20"/>
-                                      <w:lang w:val="de-DE"/>
-                                    </w:rPr>
-                                    <w:t>)</w:t>
+                                    <w:t>Intercultural training (2 days)</w:t>
                                   </w:r>
                                 </w:p>
                               </w:tc>
@@ -9904,73 +9376,7 @@
                                             <w:sz w:val="20"/>
                                             <w:lang w:val="de-DE"/>
                                           </w:rPr>
-                                          <w:t xml:space="preserve">School </w:t>
-                                        </w:r>
-                                        <w:proofErr w:type="spellStart"/>
-                                        <w:r>
-                                          <w:rPr>
-                                            <w:rFonts w:ascii="Trebuchet MS" w:hAnsi="Trebuchet MS"/>
-                                            <w:b/>
-                                            <w:color w:val="000000" w:themeColor="text1"/>
-                                            <w:sz w:val="20"/>
-                                            <w:lang w:val="de-DE"/>
-                                          </w:rPr>
-                                          <w:t>exchange</w:t>
-                                        </w:r>
-                                        <w:proofErr w:type="spellEnd"/>
-                                        <w:r>
-                                          <w:rPr>
-                                            <w:rFonts w:ascii="Trebuchet MS" w:hAnsi="Trebuchet MS"/>
-                                            <w:b/>
-                                            <w:color w:val="000000" w:themeColor="text1"/>
-                                            <w:sz w:val="20"/>
-                                            <w:lang w:val="de-DE"/>
-                                          </w:rPr>
-                                          <w:t xml:space="preserve"> </w:t>
-                                        </w:r>
-                                        <w:proofErr w:type="spellStart"/>
-                                        <w:r>
-                                          <w:rPr>
-                                            <w:rFonts w:ascii="Trebuchet MS" w:hAnsi="Trebuchet MS"/>
-                                            <w:b/>
-                                            <w:color w:val="000000" w:themeColor="text1"/>
-                                            <w:sz w:val="20"/>
-                                            <w:lang w:val="de-DE"/>
-                                          </w:rPr>
-                                          <w:t>to</w:t>
-                                        </w:r>
-                                        <w:proofErr w:type="spellEnd"/>
-                                        <w:r>
-                                          <w:rPr>
-                                            <w:rFonts w:ascii="Trebuchet MS" w:hAnsi="Trebuchet MS"/>
-                                            <w:b/>
-                                            <w:color w:val="000000" w:themeColor="text1"/>
-                                            <w:sz w:val="20"/>
-                                            <w:lang w:val="de-DE"/>
-                                          </w:rPr>
-                                          <w:t xml:space="preserve"> </w:t>
-                                        </w:r>
-                                        <w:proofErr w:type="spellStart"/>
-                                        <w:r>
-                                          <w:rPr>
-                                            <w:rFonts w:ascii="Trebuchet MS" w:hAnsi="Trebuchet MS"/>
-                                            <w:b/>
-                                            <w:color w:val="000000" w:themeColor="text1"/>
-                                            <w:sz w:val="20"/>
-                                            <w:lang w:val="de-DE"/>
-                                          </w:rPr>
-                                          <w:t>Instituto</w:t>
-                                        </w:r>
-                                        <w:proofErr w:type="spellEnd"/>
-                                        <w:r>
-                                          <w:rPr>
-                                            <w:rFonts w:ascii="Trebuchet MS" w:hAnsi="Trebuchet MS"/>
-                                            <w:b/>
-                                            <w:color w:val="000000" w:themeColor="text1"/>
-                                            <w:sz w:val="20"/>
-                                            <w:lang w:val="de-DE"/>
-                                          </w:rPr>
-                                          <w:t xml:space="preserve"> de Ballester, Buenos Aires, Argentina</w:t>
+                                          <w:t>School exchange to Instituto de Ballester, Buenos Aires, Argentina</w:t>
                                         </w:r>
                                       </w:p>
                                     </w:tc>
@@ -10076,73 +9482,7 @@
                                       <w:sz w:val="20"/>
                                       <w:lang w:val="de-DE"/>
                                     </w:rPr>
-                                    <w:t xml:space="preserve">School </w:t>
-                                  </w:r>
-                                  <w:proofErr w:type="spellStart"/>
-                                  <w:r>
-                                    <w:rPr>
-                                      <w:rFonts w:ascii="Trebuchet MS" w:hAnsi="Trebuchet MS"/>
-                                      <w:b/>
-                                      <w:color w:val="000000" w:themeColor="text1"/>
-                                      <w:sz w:val="20"/>
-                                      <w:lang w:val="de-DE"/>
-                                    </w:rPr>
-                                    <w:t>exchange</w:t>
-                                  </w:r>
-                                  <w:proofErr w:type="spellEnd"/>
-                                  <w:r>
-                                    <w:rPr>
-                                      <w:rFonts w:ascii="Trebuchet MS" w:hAnsi="Trebuchet MS"/>
-                                      <w:b/>
-                                      <w:color w:val="000000" w:themeColor="text1"/>
-                                      <w:sz w:val="20"/>
-                                      <w:lang w:val="de-DE"/>
-                                    </w:rPr>
-                                    <w:t xml:space="preserve"> </w:t>
-                                  </w:r>
-                                  <w:proofErr w:type="spellStart"/>
-                                  <w:r>
-                                    <w:rPr>
-                                      <w:rFonts w:ascii="Trebuchet MS" w:hAnsi="Trebuchet MS"/>
-                                      <w:b/>
-                                      <w:color w:val="000000" w:themeColor="text1"/>
-                                      <w:sz w:val="20"/>
-                                      <w:lang w:val="de-DE"/>
-                                    </w:rPr>
-                                    <w:t>to</w:t>
-                                  </w:r>
-                                  <w:proofErr w:type="spellEnd"/>
-                                  <w:r>
-                                    <w:rPr>
-                                      <w:rFonts w:ascii="Trebuchet MS" w:hAnsi="Trebuchet MS"/>
-                                      <w:b/>
-                                      <w:color w:val="000000" w:themeColor="text1"/>
-                                      <w:sz w:val="20"/>
-                                      <w:lang w:val="de-DE"/>
-                                    </w:rPr>
-                                    <w:t xml:space="preserve"> </w:t>
-                                  </w:r>
-                                  <w:proofErr w:type="spellStart"/>
-                                  <w:r>
-                                    <w:rPr>
-                                      <w:rFonts w:ascii="Trebuchet MS" w:hAnsi="Trebuchet MS"/>
-                                      <w:b/>
-                                      <w:color w:val="000000" w:themeColor="text1"/>
-                                      <w:sz w:val="20"/>
-                                      <w:lang w:val="de-DE"/>
-                                    </w:rPr>
-                                    <w:t>Instituto</w:t>
-                                  </w:r>
-                                  <w:proofErr w:type="spellEnd"/>
-                                  <w:r>
-                                    <w:rPr>
-                                      <w:rFonts w:ascii="Trebuchet MS" w:hAnsi="Trebuchet MS"/>
-                                      <w:b/>
-                                      <w:color w:val="000000" w:themeColor="text1"/>
-                                      <w:sz w:val="20"/>
-                                      <w:lang w:val="de-DE"/>
-                                    </w:rPr>
-                                    <w:t xml:space="preserve"> de Ballester, Buenos Aires, Argentina</w:t>
+                                    <w:t>School exchange to Instituto de Ballester, Buenos Aires, Argentina</w:t>
                                   </w:r>
                                 </w:p>
                               </w:tc>
@@ -10373,27 +9713,7 @@
                                             <w:color w:val="000000" w:themeColor="text1"/>
                                             <w:sz w:val="20"/>
                                           </w:rPr>
-                                          <w:t xml:space="preserve">NOVA Network 3 meeting, </w:t>
-                                        </w:r>
-                                        <w:proofErr w:type="spellStart"/>
-                                        <w:r>
-                                          <w:rPr>
-                                            <w:rFonts w:ascii="Trebuchet MS" w:hAnsi="Trebuchet MS"/>
-                                            <w:b/>
-                                            <w:color w:val="000000" w:themeColor="text1"/>
-                                            <w:sz w:val="20"/>
-                                          </w:rPr>
-                                          <w:t>Nikhef</w:t>
-                                        </w:r>
-                                        <w:proofErr w:type="spellEnd"/>
-                                        <w:r>
-                                          <w:rPr>
-                                            <w:rFonts w:ascii="Trebuchet MS" w:hAnsi="Trebuchet MS"/>
-                                            <w:b/>
-                                            <w:color w:val="000000" w:themeColor="text1"/>
-                                            <w:sz w:val="20"/>
-                                          </w:rPr>
-                                          <w:t xml:space="preserve"> Amsterdam</w:t>
+                                          <w:t>NOVA Network 3 meeting, Nikhef Amsterdam</w:t>
                                         </w:r>
                                       </w:p>
                                       <w:p>
@@ -10405,23 +9725,13 @@
                                             <w:sz w:val="20"/>
                                           </w:rPr>
                                         </w:pPr>
-                                        <w:proofErr w:type="spellStart"/>
-                                        <w:r>
-                                          <w:rPr>
-                                            <w:rFonts w:ascii="Trebuchet MS" w:hAnsi="Trebuchet MS"/>
-                                            <w:color w:val="000000" w:themeColor="text1"/>
-                                            <w:sz w:val="20"/>
-                                          </w:rPr>
-                                          <w:t>Lepto</w:t>
-                                        </w:r>
-                                        <w:proofErr w:type="spellEnd"/>
-                                        <w:r>
-                                          <w:rPr>
-                                            <w:rFonts w:ascii="Trebuchet MS" w:hAnsi="Trebuchet MS"/>
-                                            <w:color w:val="000000" w:themeColor="text1"/>
-                                            <w:sz w:val="20"/>
-                                          </w:rPr>
-                                          <w:t>-hadronic modelling of gamma-ray burst afterglows</w:t>
+                                        <w:r>
+                                          <w:rPr>
+                                            <w:rFonts w:ascii="Trebuchet MS" w:hAnsi="Trebuchet MS"/>
+                                            <w:color w:val="000000" w:themeColor="text1"/>
+                                            <w:sz w:val="20"/>
+                                          </w:rPr>
+                                          <w:t>Lepto-hadronic modelling of gamma-ray burst afterglows</w:t>
                                         </w:r>
                                       </w:p>
                                     </w:tc>
@@ -10556,27 +9866,7 @@
                                       <w:color w:val="000000" w:themeColor="text1"/>
                                       <w:sz w:val="20"/>
                                     </w:rPr>
-                                    <w:t xml:space="preserve">NOVA Network 3 meeting, </w:t>
-                                  </w:r>
-                                  <w:proofErr w:type="spellStart"/>
-                                  <w:r>
-                                    <w:rPr>
-                                      <w:rFonts w:ascii="Trebuchet MS" w:hAnsi="Trebuchet MS"/>
-                                      <w:b/>
-                                      <w:color w:val="000000" w:themeColor="text1"/>
-                                      <w:sz w:val="20"/>
-                                    </w:rPr>
-                                    <w:t>Nikhef</w:t>
-                                  </w:r>
-                                  <w:proofErr w:type="spellEnd"/>
-                                  <w:r>
-                                    <w:rPr>
-                                      <w:rFonts w:ascii="Trebuchet MS" w:hAnsi="Trebuchet MS"/>
-                                      <w:b/>
-                                      <w:color w:val="000000" w:themeColor="text1"/>
-                                      <w:sz w:val="20"/>
-                                    </w:rPr>
-                                    <w:t xml:space="preserve"> Amsterdam</w:t>
+                                    <w:t>NOVA Network 3 meeting, Nikhef Amsterdam</w:t>
                                   </w:r>
                                 </w:p>
                                 <w:p>
@@ -10588,23 +9878,13 @@
                                       <w:sz w:val="20"/>
                                     </w:rPr>
                                   </w:pPr>
-                                  <w:proofErr w:type="spellStart"/>
-                                  <w:r>
-                                    <w:rPr>
-                                      <w:rFonts w:ascii="Trebuchet MS" w:hAnsi="Trebuchet MS"/>
-                                      <w:color w:val="000000" w:themeColor="text1"/>
-                                      <w:sz w:val="20"/>
-                                    </w:rPr>
-                                    <w:t>Lepto</w:t>
-                                  </w:r>
-                                  <w:proofErr w:type="spellEnd"/>
-                                  <w:r>
-                                    <w:rPr>
-                                      <w:rFonts w:ascii="Trebuchet MS" w:hAnsi="Trebuchet MS"/>
-                                      <w:color w:val="000000" w:themeColor="text1"/>
-                                      <w:sz w:val="20"/>
-                                    </w:rPr>
-                                    <w:t>-hadronic modelling of gamma-ray burst afterglows</w:t>
+                                  <w:r>
+                                    <w:rPr>
+                                      <w:rFonts w:ascii="Trebuchet MS" w:hAnsi="Trebuchet MS"/>
+                                      <w:color w:val="000000" w:themeColor="text1"/>
+                                      <w:sz w:val="20"/>
+                                    </w:rPr>
+                                    <w:t>Lepto-hadronic modelling of gamma-ray burst afterglows</w:t>
                                   </w:r>
                                 </w:p>
                               </w:tc>
@@ -11222,19 +10502,8 @@
                                             <w:color w:val="000000" w:themeColor="text1"/>
                                             <w:sz w:val="20"/>
                                           </w:rPr>
-                                          <w:t xml:space="preserve">Workshop on Numerical Multi-messenger </w:t>
-                                        </w:r>
-                                        <w:proofErr w:type="spellStart"/>
-                                        <w:r>
-                                          <w:rPr>
-                                            <w:rFonts w:ascii="Trebuchet MS" w:hAnsi="Trebuchet MS"/>
-                                            <w:b/>
-                                            <w:color w:val="000000" w:themeColor="text1"/>
-                                            <w:sz w:val="20"/>
-                                          </w:rPr>
-                                          <w:t>Modeling</w:t>
-                                        </w:r>
-                                        <w:proofErr w:type="spellEnd"/>
+                                          <w:t>Workshop on Numerical Multi-messenger Modeling</w:t>
+                                        </w:r>
                                         <w:r>
                                           <w:rPr>
                                             <w:rFonts w:ascii="Trebuchet MS" w:hAnsi="Trebuchet MS"/>
@@ -11413,19 +10682,8 @@
                                       <w:color w:val="000000" w:themeColor="text1"/>
                                       <w:sz w:val="20"/>
                                     </w:rPr>
-                                    <w:t xml:space="preserve">Workshop on Numerical Multi-messenger </w:t>
-                                  </w:r>
-                                  <w:proofErr w:type="spellStart"/>
-                                  <w:r>
-                                    <w:rPr>
-                                      <w:rFonts w:ascii="Trebuchet MS" w:hAnsi="Trebuchet MS"/>
-                                      <w:b/>
-                                      <w:color w:val="000000" w:themeColor="text1"/>
-                                      <w:sz w:val="20"/>
-                                    </w:rPr>
-                                    <w:t>Modeling</w:t>
-                                  </w:r>
-                                  <w:proofErr w:type="spellEnd"/>
+                                    <w:t>Workshop on Numerical Multi-messenger Modeling</w:t>
+                                  </w:r>
                                   <w:r>
                                     <w:rPr>
                                       <w:rFonts w:ascii="Trebuchet MS" w:hAnsi="Trebuchet MS"/>
@@ -12008,23 +11266,13 @@
                                             <w:sz w:val="20"/>
                                           </w:rPr>
                                         </w:pPr>
-                                        <w:proofErr w:type="spellStart"/>
-                                        <w:r>
-                                          <w:rPr>
-                                            <w:rFonts w:ascii="Trebuchet MS" w:hAnsi="Trebuchet MS"/>
-                                            <w:color w:val="000000" w:themeColor="text1"/>
-                                            <w:sz w:val="20"/>
-                                          </w:rPr>
-                                          <w:t>Lepto</w:t>
-                                        </w:r>
-                                        <w:proofErr w:type="spellEnd"/>
-                                        <w:r>
-                                          <w:rPr>
-                                            <w:rFonts w:ascii="Trebuchet MS" w:hAnsi="Trebuchet MS"/>
-                                            <w:color w:val="000000" w:themeColor="text1"/>
-                                            <w:sz w:val="20"/>
-                                          </w:rPr>
-                                          <w:t>-Hadronic Very-High-Energy GRB Afterglows</w:t>
+                                        <w:r>
+                                          <w:rPr>
+                                            <w:rFonts w:ascii="Trebuchet MS" w:hAnsi="Trebuchet MS"/>
+                                            <w:color w:val="000000" w:themeColor="text1"/>
+                                            <w:sz w:val="20"/>
+                                          </w:rPr>
+                                          <w:t>Lepto-Hadronic Very-High-Energy GRB Afterglows</w:t>
                                         </w:r>
                                       </w:p>
                                     </w:tc>
@@ -12186,23 +11434,13 @@
                                       <w:sz w:val="20"/>
                                     </w:rPr>
                                   </w:pPr>
-                                  <w:proofErr w:type="spellStart"/>
-                                  <w:r>
-                                    <w:rPr>
-                                      <w:rFonts w:ascii="Trebuchet MS" w:hAnsi="Trebuchet MS"/>
-                                      <w:color w:val="000000" w:themeColor="text1"/>
-                                      <w:sz w:val="20"/>
-                                    </w:rPr>
-                                    <w:t>Lepto</w:t>
-                                  </w:r>
-                                  <w:proofErr w:type="spellEnd"/>
-                                  <w:r>
-                                    <w:rPr>
-                                      <w:rFonts w:ascii="Trebuchet MS" w:hAnsi="Trebuchet MS"/>
-                                      <w:color w:val="000000" w:themeColor="text1"/>
-                                      <w:sz w:val="20"/>
-                                    </w:rPr>
-                                    <w:t>-Hadronic Very-High-Energy GRB Afterglows</w:t>
+                                  <w:r>
+                                    <w:rPr>
+                                      <w:rFonts w:ascii="Trebuchet MS" w:hAnsi="Trebuchet MS"/>
+                                      <w:color w:val="000000" w:themeColor="text1"/>
+                                      <w:sz w:val="20"/>
+                                    </w:rPr>
+                                    <w:t>Lepto-Hadronic Very-High-Energy GRB Afterglows</w:t>
                                   </w:r>
                                 </w:p>
                               </w:tc>
@@ -12434,19 +11672,8 @@
                                             <w:color w:val="000000" w:themeColor="text1"/>
                                             <w:sz w:val="20"/>
                                           </w:rPr>
-                                          <w:t xml:space="preserve">Gamma Group Seminar, DESY </w:t>
-                                        </w:r>
-                                        <w:proofErr w:type="spellStart"/>
-                                        <w:r>
-                                          <w:rPr>
-                                            <w:rFonts w:ascii="Trebuchet MS" w:hAnsi="Trebuchet MS"/>
-                                            <w:b/>
-                                            <w:color w:val="000000" w:themeColor="text1"/>
-                                            <w:sz w:val="20"/>
-                                          </w:rPr>
-                                          <w:t>Zeuthen</w:t>
-                                        </w:r>
-                                        <w:proofErr w:type="spellEnd"/>
+                                          <w:t>Gamma Group Seminar, DESY Zeuthen</w:t>
+                                        </w:r>
                                       </w:p>
                                       <w:p>
                                         <w:pPr>
@@ -12590,19 +11817,8 @@
                                       <w:color w:val="000000" w:themeColor="text1"/>
                                       <w:sz w:val="20"/>
                                     </w:rPr>
-                                    <w:t xml:space="preserve">Gamma Group Seminar, DESY </w:t>
-                                  </w:r>
-                                  <w:proofErr w:type="spellStart"/>
-                                  <w:r>
-                                    <w:rPr>
-                                      <w:rFonts w:ascii="Trebuchet MS" w:hAnsi="Trebuchet MS"/>
-                                      <w:b/>
-                                      <w:color w:val="000000" w:themeColor="text1"/>
-                                      <w:sz w:val="20"/>
-                                    </w:rPr>
-                                    <w:t>Zeuthen</w:t>
-                                  </w:r>
-                                  <w:proofErr w:type="spellEnd"/>
+                                    <w:t>Gamma Group Seminar, DESY Zeuthen</w:t>
+                                  </w:r>
                                 </w:p>
                                 <w:p>
                                   <w:pPr>
@@ -12797,27 +12013,7 @@
                                             <w:color w:val="000000" w:themeColor="text1"/>
                                             <w:sz w:val="20"/>
                                           </w:rPr>
-                                          <w:t xml:space="preserve">DESY </w:t>
-                                        </w:r>
-                                        <w:proofErr w:type="spellStart"/>
-                                        <w:r>
-                                          <w:rPr>
-                                            <w:rFonts w:ascii="Trebuchet MS" w:hAnsi="Trebuchet MS"/>
-                                            <w:b/>
-                                            <w:color w:val="000000" w:themeColor="text1"/>
-                                            <w:sz w:val="20"/>
-                                          </w:rPr>
-                                          <w:t>Astroparticle</w:t>
-                                        </w:r>
-                                        <w:proofErr w:type="spellEnd"/>
-                                        <w:r>
-                                          <w:rPr>
-                                            <w:rFonts w:ascii="Trebuchet MS" w:hAnsi="Trebuchet MS"/>
-                                            <w:b/>
-                                            <w:color w:val="000000" w:themeColor="text1"/>
-                                            <w:sz w:val="20"/>
-                                          </w:rPr>
-                                          <w:t xml:space="preserve"> division retreat, Potsdam, Germany</w:t>
+                                          <w:t>DESY Astroparticle division retreat, Potsdam, Germany</w:t>
                                         </w:r>
                                       </w:p>
                                       <w:p>
@@ -12945,27 +12141,7 @@
                                       <w:color w:val="000000" w:themeColor="text1"/>
                                       <w:sz w:val="20"/>
                                     </w:rPr>
-                                    <w:t xml:space="preserve">DESY </w:t>
-                                  </w:r>
-                                  <w:proofErr w:type="spellStart"/>
-                                  <w:r>
-                                    <w:rPr>
-                                      <w:rFonts w:ascii="Trebuchet MS" w:hAnsi="Trebuchet MS"/>
-                                      <w:b/>
-                                      <w:color w:val="000000" w:themeColor="text1"/>
-                                      <w:sz w:val="20"/>
-                                    </w:rPr>
-                                    <w:t>Astroparticle</w:t>
-                                  </w:r>
-                                  <w:proofErr w:type="spellEnd"/>
-                                  <w:r>
-                                    <w:rPr>
-                                      <w:rFonts w:ascii="Trebuchet MS" w:hAnsi="Trebuchet MS"/>
-                                      <w:b/>
-                                      <w:color w:val="000000" w:themeColor="text1"/>
-                                      <w:sz w:val="20"/>
-                                    </w:rPr>
-                                    <w:t xml:space="preserve"> division retreat, Potsdam, Germany</w:t>
+                                    <w:t>DESY Astroparticle division retreat, Potsdam, Germany</w:t>
                                   </w:r>
                                 </w:p>
                                 <w:p>
@@ -13193,27 +12369,7 @@
                                             <w:color w:val="000000" w:themeColor="text1"/>
                                             <w:sz w:val="20"/>
                                           </w:rPr>
-                                          <w:t xml:space="preserve">Science Club of </w:t>
-                                        </w:r>
-                                        <w:proofErr w:type="spellStart"/>
-                                        <w:r>
-                                          <w:rPr>
-                                            <w:rFonts w:ascii="Trebuchet MS" w:hAnsi="Trebuchet MS"/>
-                                            <w:b/>
-                                            <w:color w:val="000000" w:themeColor="text1"/>
-                                            <w:sz w:val="20"/>
-                                          </w:rPr>
-                                          <w:t>Multimessenger</w:t>
-                                        </w:r>
-                                        <w:proofErr w:type="spellEnd"/>
-                                        <w:r>
-                                          <w:rPr>
-                                            <w:rFonts w:ascii="Trebuchet MS" w:hAnsi="Trebuchet MS"/>
-                                            <w:b/>
-                                            <w:color w:val="000000" w:themeColor="text1"/>
-                                            <w:sz w:val="20"/>
-                                          </w:rPr>
-                                          <w:t xml:space="preserve"> School (online, incl. </w:t>
+                                          <w:t xml:space="preserve">Science Club of Multimessenger School (online, incl. </w:t>
                                         </w:r>
                                         <w:r>
                                           <w:rPr>
@@ -13397,27 +12553,7 @@
                                       <w:color w:val="000000" w:themeColor="text1"/>
                                       <w:sz w:val="20"/>
                                     </w:rPr>
-                                    <w:t xml:space="preserve">Science Club of </w:t>
-                                  </w:r>
-                                  <w:proofErr w:type="spellStart"/>
-                                  <w:r>
-                                    <w:rPr>
-                                      <w:rFonts w:ascii="Trebuchet MS" w:hAnsi="Trebuchet MS"/>
-                                      <w:b/>
-                                      <w:color w:val="000000" w:themeColor="text1"/>
-                                      <w:sz w:val="20"/>
-                                    </w:rPr>
-                                    <w:t>Multimessenger</w:t>
-                                  </w:r>
-                                  <w:proofErr w:type="spellEnd"/>
-                                  <w:r>
-                                    <w:rPr>
-                                      <w:rFonts w:ascii="Trebuchet MS" w:hAnsi="Trebuchet MS"/>
-                                      <w:b/>
-                                      <w:color w:val="000000" w:themeColor="text1"/>
-                                      <w:sz w:val="20"/>
-                                    </w:rPr>
-                                    <w:t xml:space="preserve"> School (online, incl. </w:t>
+                                    <w:t xml:space="preserve">Science Club of Multimessenger School (online, incl. </w:t>
                                   </w:r>
                                   <w:r>
                                     <w:rPr>
@@ -14022,7 +13158,6 @@
                                           </w:rPr>
                                           <w:t xml:space="preserve">Invited: </w:t>
                                         </w:r>
-                                        <w:proofErr w:type="spellStart"/>
                                         <w:r>
                                           <w:rPr>
                                             <w:rFonts w:ascii="Trebuchet MS" w:hAnsi="Trebuchet MS"/>
@@ -14030,29 +13165,8 @@
                                             <w:color w:val="000000" w:themeColor="text1"/>
                                             <w:sz w:val="20"/>
                                           </w:rPr>
-                                          <w:t>Astroparticle</w:t>
-                                        </w:r>
-                                        <w:proofErr w:type="spellEnd"/>
-                                        <w:r>
-                                          <w:rPr>
-                                            <w:rFonts w:ascii="Trebuchet MS" w:hAnsi="Trebuchet MS"/>
-                                            <w:b/>
-                                            <w:color w:val="000000" w:themeColor="text1"/>
-                                            <w:sz w:val="20"/>
-                                          </w:rPr>
-                                          <w:t xml:space="preserve"> Seminar at DESY, </w:t>
-                                        </w:r>
-                                        <w:proofErr w:type="spellStart"/>
-                                        <w:r>
-                                          <w:rPr>
-                                            <w:rFonts w:ascii="Trebuchet MS" w:hAnsi="Trebuchet MS"/>
-                                            <w:b/>
-                                            <w:color w:val="000000" w:themeColor="text1"/>
-                                            <w:sz w:val="20"/>
-                                          </w:rPr>
-                                          <w:t>Zeuthen</w:t>
-                                        </w:r>
-                                        <w:proofErr w:type="spellEnd"/>
+                                          <w:t>Astroparticle Seminar at DESY, Zeuthen</w:t>
+                                        </w:r>
                                       </w:p>
                                       <w:p>
                                         <w:pPr>
@@ -14173,7 +13287,6 @@
                                     </w:rPr>
                                     <w:t xml:space="preserve">Invited: </w:t>
                                   </w:r>
-                                  <w:proofErr w:type="spellStart"/>
                                   <w:r>
                                     <w:rPr>
                                       <w:rFonts w:ascii="Trebuchet MS" w:hAnsi="Trebuchet MS"/>
@@ -14181,29 +13294,8 @@
                                       <w:color w:val="000000" w:themeColor="text1"/>
                                       <w:sz w:val="20"/>
                                     </w:rPr>
-                                    <w:t>Astroparticle</w:t>
-                                  </w:r>
-                                  <w:proofErr w:type="spellEnd"/>
-                                  <w:r>
-                                    <w:rPr>
-                                      <w:rFonts w:ascii="Trebuchet MS" w:hAnsi="Trebuchet MS"/>
-                                      <w:b/>
-                                      <w:color w:val="000000" w:themeColor="text1"/>
-                                      <w:sz w:val="20"/>
-                                    </w:rPr>
-                                    <w:t xml:space="preserve"> Seminar at DESY, </w:t>
-                                  </w:r>
-                                  <w:proofErr w:type="spellStart"/>
-                                  <w:r>
-                                    <w:rPr>
-                                      <w:rFonts w:ascii="Trebuchet MS" w:hAnsi="Trebuchet MS"/>
-                                      <w:b/>
-                                      <w:color w:val="000000" w:themeColor="text1"/>
-                                      <w:sz w:val="20"/>
-                                    </w:rPr>
-                                    <w:t>Zeuthen</w:t>
-                                  </w:r>
-                                  <w:proofErr w:type="spellEnd"/>
+                                    <w:t>Astroparticle Seminar at DESY, Zeuthen</w:t>
+                                  </w:r>
                                 </w:p>
                                 <w:p>
                                   <w:pPr>
@@ -14901,7 +13993,6 @@
                                             <w:sz w:val="20"/>
                                           </w:rPr>
                                         </w:pPr>
-                                        <w:proofErr w:type="spellStart"/>
                                         <w:r>
                                           <w:rPr>
                                             <w:rFonts w:ascii="Trebuchet MS" w:hAnsi="Trebuchet MS"/>
@@ -14909,17 +14000,7 @@
                                             <w:color w:val="000000" w:themeColor="text1"/>
                                             <w:sz w:val="20"/>
                                           </w:rPr>
-                                          <w:t>TeVPA</w:t>
-                                        </w:r>
-                                        <w:proofErr w:type="spellEnd"/>
-                                        <w:r>
-                                          <w:rPr>
-                                            <w:rFonts w:ascii="Trebuchet MS" w:hAnsi="Trebuchet MS"/>
-                                            <w:b/>
-                                            <w:color w:val="000000" w:themeColor="text1"/>
-                                            <w:sz w:val="20"/>
-                                          </w:rPr>
-                                          <w:t xml:space="preserve"> 2021</w:t>
+                                          <w:t>TeVPA 2021</w:t>
                                         </w:r>
                                         <w:r>
                                           <w:rPr>
@@ -15042,7 +14123,6 @@
                                       <w:sz w:val="20"/>
                                     </w:rPr>
                                   </w:pPr>
-                                  <w:proofErr w:type="spellStart"/>
                                   <w:r>
                                     <w:rPr>
                                       <w:rFonts w:ascii="Trebuchet MS" w:hAnsi="Trebuchet MS"/>
@@ -15050,17 +14130,7 @@
                                       <w:color w:val="000000" w:themeColor="text1"/>
                                       <w:sz w:val="20"/>
                                     </w:rPr>
-                                    <w:t>TeVPA</w:t>
-                                  </w:r>
-                                  <w:proofErr w:type="spellEnd"/>
-                                  <w:r>
-                                    <w:rPr>
-                                      <w:rFonts w:ascii="Trebuchet MS" w:hAnsi="Trebuchet MS"/>
-                                      <w:b/>
-                                      <w:color w:val="000000" w:themeColor="text1"/>
-                                      <w:sz w:val="20"/>
-                                    </w:rPr>
-                                    <w:t xml:space="preserve"> 2021</w:t>
+                                    <w:t>TeVPA 2021</w:t>
                                   </w:r>
                                   <w:r>
                                     <w:rPr>
@@ -15689,27 +14759,7 @@
                                             <w:color w:val="000000" w:themeColor="text1"/>
                                             <w:sz w:val="20"/>
                                           </w:rPr>
-                                          <w:t xml:space="preserve">Science Club of </w:t>
-                                        </w:r>
-                                        <w:proofErr w:type="spellStart"/>
-                                        <w:r>
-                                          <w:rPr>
-                                            <w:rFonts w:ascii="Trebuchet MS" w:hAnsi="Trebuchet MS"/>
-                                            <w:b/>
-                                            <w:color w:val="000000" w:themeColor="text1"/>
-                                            <w:sz w:val="20"/>
-                                          </w:rPr>
-                                          <w:t>Multimessenger</w:t>
-                                        </w:r>
-                                        <w:proofErr w:type="spellEnd"/>
-                                        <w:r>
-                                          <w:rPr>
-                                            <w:rFonts w:ascii="Trebuchet MS" w:hAnsi="Trebuchet MS"/>
-                                            <w:b/>
-                                            <w:color w:val="000000" w:themeColor="text1"/>
-                                            <w:sz w:val="20"/>
-                                          </w:rPr>
-                                          <w:t xml:space="preserve"> School (online, incl. </w:t>
+                                          <w:t xml:space="preserve">Science Club of Multimessenger School (online, incl. </w:t>
                                         </w:r>
                                         <w:r>
                                           <w:rPr>
@@ -15732,7 +14782,6 @@
                                             <w:lang w:val="de-DE"/>
                                           </w:rPr>
                                         </w:pPr>
-                                        <w:proofErr w:type="spellStart"/>
                                         <w:r>
                                           <w:rPr>
                                             <w:rFonts w:ascii="Trebuchet MS" w:hAnsi="Trebuchet MS"/>
@@ -15740,17 +14789,7 @@
                                             <w:sz w:val="20"/>
                                             <w:lang w:val="de-DE"/>
                                           </w:rPr>
-                                          <w:t>Relativistic</w:t>
-                                        </w:r>
-                                        <w:proofErr w:type="spellEnd"/>
-                                        <w:r>
-                                          <w:rPr>
-                                            <w:rFonts w:ascii="Trebuchet MS" w:hAnsi="Trebuchet MS"/>
-                                            <w:color w:val="000000" w:themeColor="text1"/>
-                                            <w:sz w:val="20"/>
-                                            <w:lang w:val="de-DE"/>
-                                          </w:rPr>
-                                          <w:t xml:space="preserve"> Shocks</w:t>
+                                          <w:t>Relativistic Shocks</w:t>
                                         </w:r>
                                         <w:r>
                                           <w:rPr>
@@ -15904,27 +14943,7 @@
                                       <w:color w:val="000000" w:themeColor="text1"/>
                                       <w:sz w:val="20"/>
                                     </w:rPr>
-                                    <w:t xml:space="preserve">Science Club of </w:t>
-                                  </w:r>
-                                  <w:proofErr w:type="spellStart"/>
-                                  <w:r>
-                                    <w:rPr>
-                                      <w:rFonts w:ascii="Trebuchet MS" w:hAnsi="Trebuchet MS"/>
-                                      <w:b/>
-                                      <w:color w:val="000000" w:themeColor="text1"/>
-                                      <w:sz w:val="20"/>
-                                    </w:rPr>
-                                    <w:t>Multimessenger</w:t>
-                                  </w:r>
-                                  <w:proofErr w:type="spellEnd"/>
-                                  <w:r>
-                                    <w:rPr>
-                                      <w:rFonts w:ascii="Trebuchet MS" w:hAnsi="Trebuchet MS"/>
-                                      <w:b/>
-                                      <w:color w:val="000000" w:themeColor="text1"/>
-                                      <w:sz w:val="20"/>
-                                    </w:rPr>
-                                    <w:t xml:space="preserve"> School (online, incl. </w:t>
+                                    <w:t xml:space="preserve">Science Club of Multimessenger School (online, incl. </w:t>
                                   </w:r>
                                   <w:r>
                                     <w:rPr>
@@ -15947,7 +14966,6 @@
                                       <w:lang w:val="de-DE"/>
                                     </w:rPr>
                                   </w:pPr>
-                                  <w:proofErr w:type="spellStart"/>
                                   <w:r>
                                     <w:rPr>
                                       <w:rFonts w:ascii="Trebuchet MS" w:hAnsi="Trebuchet MS"/>
@@ -15955,17 +14973,7 @@
                                       <w:sz w:val="20"/>
                                       <w:lang w:val="de-DE"/>
                                     </w:rPr>
-                                    <w:t>Relativistic</w:t>
-                                  </w:r>
-                                  <w:proofErr w:type="spellEnd"/>
-                                  <w:r>
-                                    <w:rPr>
-                                      <w:rFonts w:ascii="Trebuchet MS" w:hAnsi="Trebuchet MS"/>
-                                      <w:color w:val="000000" w:themeColor="text1"/>
-                                      <w:sz w:val="20"/>
-                                      <w:lang w:val="de-DE"/>
-                                    </w:rPr>
-                                    <w:t xml:space="preserve"> Shocks</w:t>
+                                    <w:t>Relativistic Shocks</w:t>
                                   </w:r>
                                   <w:r>
                                     <w:rPr>
@@ -16204,19 +15212,8 @@
                                             <w:color w:val="000000" w:themeColor="text1"/>
                                             <w:sz w:val="20"/>
                                           </w:rPr>
-                                          <w:t xml:space="preserve">Seminar, DESY </w:t>
-                                        </w:r>
-                                        <w:proofErr w:type="spellStart"/>
-                                        <w:r>
-                                          <w:rPr>
-                                            <w:rFonts w:ascii="Trebuchet MS" w:hAnsi="Trebuchet MS"/>
-                                            <w:b/>
-                                            <w:color w:val="000000" w:themeColor="text1"/>
-                                            <w:sz w:val="20"/>
-                                          </w:rPr>
-                                          <w:t>Zeuthen</w:t>
-                                        </w:r>
-                                        <w:proofErr w:type="spellEnd"/>
+                                          <w:t>Seminar, DESY Zeuthen</w:t>
+                                        </w:r>
                                       </w:p>
                                       <w:p>
                                         <w:pPr>
@@ -16461,19 +15458,8 @@
                                       <w:color w:val="000000" w:themeColor="text1"/>
                                       <w:sz w:val="20"/>
                                     </w:rPr>
-                                    <w:t xml:space="preserve">Seminar, DESY </w:t>
-                                  </w:r>
-                                  <w:proofErr w:type="spellStart"/>
-                                  <w:r>
-                                    <w:rPr>
-                                      <w:rFonts w:ascii="Trebuchet MS" w:hAnsi="Trebuchet MS"/>
-                                      <w:b/>
-                                      <w:color w:val="000000" w:themeColor="text1"/>
-                                      <w:sz w:val="20"/>
-                                    </w:rPr>
-                                    <w:t>Zeuthen</w:t>
-                                  </w:r>
-                                  <w:proofErr w:type="spellEnd"/>
+                                    <w:t>Seminar, DESY Zeuthen</w:t>
+                                  </w:r>
                                 </w:p>
                                 <w:p>
                                   <w:pPr>
@@ -16787,9 +15773,8 @@
                                             <w:sz w:val="20"/>
                                             <w:lang w:val="de-DE"/>
                                           </w:rPr>
-                                          <w:t xml:space="preserve">FACT - </w:t>
-                                        </w:r>
-                                        <w:proofErr w:type="spellStart"/>
+                                          <w:t xml:space="preserve">FACT - Spectral </w:t>
+                                        </w:r>
                                         <w:r>
                                           <w:rPr>
                                             <w:rFonts w:ascii="Trebuchet MS" w:hAnsi="Trebuchet MS"/>
@@ -16797,9 +15782,8 @@
                                             <w:sz w:val="20"/>
                                             <w:lang w:val="de-DE"/>
                                           </w:rPr>
-                                          <w:t>Spectral</w:t>
-                                        </w:r>
-                                        <w:proofErr w:type="spellEnd"/>
+                                          <w:t>V</w:t>
+                                        </w:r>
                                         <w:r>
                                           <w:rPr>
                                             <w:rFonts w:ascii="Trebuchet MS" w:hAnsi="Trebuchet MS"/>
@@ -16807,9 +15791,8 @@
                                             <w:sz w:val="20"/>
                                             <w:lang w:val="de-DE"/>
                                           </w:rPr>
-                                          <w:t xml:space="preserve"> </w:t>
-                                        </w:r>
-                                        <w:proofErr w:type="spellStart"/>
+                                          <w:t>ariability of TeV-</w:t>
+                                        </w:r>
                                         <w:r>
                                           <w:rPr>
                                             <w:rFonts w:ascii="Trebuchet MS" w:hAnsi="Trebuchet MS"/>
@@ -16817,7 +15800,7 @@
                                             <w:sz w:val="20"/>
                                             <w:lang w:val="de-DE"/>
                                           </w:rPr>
-                                          <w:t>V</w:t>
+                                          <w:t>B</w:t>
                                         </w:r>
                                         <w:r>
                                           <w:rPr>
@@ -16826,67 +15809,8 @@
                                             <w:sz w:val="20"/>
                                             <w:lang w:val="de-DE"/>
                                           </w:rPr>
-                                          <w:t>ariability</w:t>
-                                        </w:r>
-                                        <w:proofErr w:type="spellEnd"/>
-                                        <w:r>
-                                          <w:rPr>
-                                            <w:rFonts w:ascii="Trebuchet MS" w:hAnsi="Trebuchet MS"/>
-                                            <w:color w:val="000000" w:themeColor="text1"/>
-                                            <w:sz w:val="20"/>
-                                            <w:lang w:val="de-DE"/>
-                                          </w:rPr>
-                                          <w:t xml:space="preserve"> </w:t>
-                                        </w:r>
-                                        <w:proofErr w:type="spellStart"/>
-                                        <w:r>
-                                          <w:rPr>
-                                            <w:rFonts w:ascii="Trebuchet MS" w:hAnsi="Trebuchet MS"/>
-                                            <w:color w:val="000000" w:themeColor="text1"/>
-                                            <w:sz w:val="20"/>
-                                            <w:lang w:val="de-DE"/>
-                                          </w:rPr>
-                                          <w:t>of</w:t>
-                                        </w:r>
-                                        <w:proofErr w:type="spellEnd"/>
-                                        <w:r>
-                                          <w:rPr>
-                                            <w:rFonts w:ascii="Trebuchet MS" w:hAnsi="Trebuchet MS"/>
-                                            <w:color w:val="000000" w:themeColor="text1"/>
-                                            <w:sz w:val="20"/>
-                                            <w:lang w:val="de-DE"/>
-                                          </w:rPr>
-                                          <w:t xml:space="preserve"> </w:t>
-                                        </w:r>
-                                        <w:proofErr w:type="spellStart"/>
-                                        <w:r>
-                                          <w:rPr>
-                                            <w:rFonts w:ascii="Trebuchet MS" w:hAnsi="Trebuchet MS"/>
-                                            <w:color w:val="000000" w:themeColor="text1"/>
-                                            <w:sz w:val="20"/>
-                                            <w:lang w:val="de-DE"/>
-                                          </w:rPr>
-                                          <w:t>TeV-</w:t>
-                                        </w:r>
-                                        <w:r>
-                                          <w:rPr>
-                                            <w:rFonts w:ascii="Trebuchet MS" w:hAnsi="Trebuchet MS"/>
-                                            <w:color w:val="000000" w:themeColor="text1"/>
-                                            <w:sz w:val="20"/>
-                                            <w:lang w:val="de-DE"/>
-                                          </w:rPr>
-                                          <w:t>B</w:t>
-                                        </w:r>
-                                        <w:r>
-                                          <w:rPr>
-                                            <w:rFonts w:ascii="Trebuchet MS" w:hAnsi="Trebuchet MS"/>
-                                            <w:color w:val="000000" w:themeColor="text1"/>
-                                            <w:sz w:val="20"/>
-                                            <w:lang w:val="de-DE"/>
-                                          </w:rPr>
                                           <w:t>lazars</w:t>
                                         </w:r>
-                                        <w:proofErr w:type="spellEnd"/>
                                       </w:p>
                                     </w:tc>
                                   </w:tr>
@@ -17050,9 +15974,8 @@
                                       <w:sz w:val="20"/>
                                       <w:lang w:val="de-DE"/>
                                     </w:rPr>
-                                    <w:t xml:space="preserve">FACT - </w:t>
-                                  </w:r>
-                                  <w:proofErr w:type="spellStart"/>
+                                    <w:t xml:space="preserve">FACT - Spectral </w:t>
+                                  </w:r>
                                   <w:r>
                                     <w:rPr>
                                       <w:rFonts w:ascii="Trebuchet MS" w:hAnsi="Trebuchet MS"/>
@@ -17060,9 +15983,8 @@
                                       <w:sz w:val="20"/>
                                       <w:lang w:val="de-DE"/>
                                     </w:rPr>
-                                    <w:t>Spectral</w:t>
-                                  </w:r>
-                                  <w:proofErr w:type="spellEnd"/>
+                                    <w:t>V</w:t>
+                                  </w:r>
                                   <w:r>
                                     <w:rPr>
                                       <w:rFonts w:ascii="Trebuchet MS" w:hAnsi="Trebuchet MS"/>
@@ -17070,9 +15992,8 @@
                                       <w:sz w:val="20"/>
                                       <w:lang w:val="de-DE"/>
                                     </w:rPr>
-                                    <w:t xml:space="preserve"> </w:t>
-                                  </w:r>
-                                  <w:proofErr w:type="spellStart"/>
+                                    <w:t>ariability of TeV-</w:t>
+                                  </w:r>
                                   <w:r>
                                     <w:rPr>
                                       <w:rFonts w:ascii="Trebuchet MS" w:hAnsi="Trebuchet MS"/>
@@ -17080,7 +16001,7 @@
                                       <w:sz w:val="20"/>
                                       <w:lang w:val="de-DE"/>
                                     </w:rPr>
-                                    <w:t>V</w:t>
+                                    <w:t>B</w:t>
                                   </w:r>
                                   <w:r>
                                     <w:rPr>
@@ -17089,67 +16010,8 @@
                                       <w:sz w:val="20"/>
                                       <w:lang w:val="de-DE"/>
                                     </w:rPr>
-                                    <w:t>ariability</w:t>
-                                  </w:r>
-                                  <w:proofErr w:type="spellEnd"/>
-                                  <w:r>
-                                    <w:rPr>
-                                      <w:rFonts w:ascii="Trebuchet MS" w:hAnsi="Trebuchet MS"/>
-                                      <w:color w:val="000000" w:themeColor="text1"/>
-                                      <w:sz w:val="20"/>
-                                      <w:lang w:val="de-DE"/>
-                                    </w:rPr>
-                                    <w:t xml:space="preserve"> </w:t>
-                                  </w:r>
-                                  <w:proofErr w:type="spellStart"/>
-                                  <w:r>
-                                    <w:rPr>
-                                      <w:rFonts w:ascii="Trebuchet MS" w:hAnsi="Trebuchet MS"/>
-                                      <w:color w:val="000000" w:themeColor="text1"/>
-                                      <w:sz w:val="20"/>
-                                      <w:lang w:val="de-DE"/>
-                                    </w:rPr>
-                                    <w:t>of</w:t>
-                                  </w:r>
-                                  <w:proofErr w:type="spellEnd"/>
-                                  <w:r>
-                                    <w:rPr>
-                                      <w:rFonts w:ascii="Trebuchet MS" w:hAnsi="Trebuchet MS"/>
-                                      <w:color w:val="000000" w:themeColor="text1"/>
-                                      <w:sz w:val="20"/>
-                                      <w:lang w:val="de-DE"/>
-                                    </w:rPr>
-                                    <w:t xml:space="preserve"> </w:t>
-                                  </w:r>
-                                  <w:proofErr w:type="spellStart"/>
-                                  <w:r>
-                                    <w:rPr>
-                                      <w:rFonts w:ascii="Trebuchet MS" w:hAnsi="Trebuchet MS"/>
-                                      <w:color w:val="000000" w:themeColor="text1"/>
-                                      <w:sz w:val="20"/>
-                                      <w:lang w:val="de-DE"/>
-                                    </w:rPr>
-                                    <w:t>TeV-</w:t>
-                                  </w:r>
-                                  <w:r>
-                                    <w:rPr>
-                                      <w:rFonts w:ascii="Trebuchet MS" w:hAnsi="Trebuchet MS"/>
-                                      <w:color w:val="000000" w:themeColor="text1"/>
-                                      <w:sz w:val="20"/>
-                                      <w:lang w:val="de-DE"/>
-                                    </w:rPr>
-                                    <w:t>B</w:t>
-                                  </w:r>
-                                  <w:r>
-                                    <w:rPr>
-                                      <w:rFonts w:ascii="Trebuchet MS" w:hAnsi="Trebuchet MS"/>
-                                      <w:color w:val="000000" w:themeColor="text1"/>
-                                      <w:sz w:val="20"/>
-                                      <w:lang w:val="de-DE"/>
-                                    </w:rPr>
                                     <w:t>lazars</w:t>
                                   </w:r>
-                                  <w:proofErr w:type="spellEnd"/>
                                 </w:p>
                               </w:tc>
                             </w:tr>
@@ -17430,27 +16292,7 @@
                                             <w:color w:val="000000" w:themeColor="text1"/>
                                             <w:sz w:val="20"/>
                                           </w:rPr>
-                                          <w:t xml:space="preserve">Annual Meeting of the </w:t>
-                                        </w:r>
-                                        <w:proofErr w:type="spellStart"/>
-                                        <w:r>
-                                          <w:rPr>
-                                            <w:rFonts w:ascii="Trebuchet MS" w:hAnsi="Trebuchet MS"/>
-                                            <w:b/>
-                                            <w:color w:val="000000" w:themeColor="text1"/>
-                                            <w:sz w:val="20"/>
-                                          </w:rPr>
-                                          <w:t>Multimessenger</w:t>
-                                        </w:r>
-                                        <w:proofErr w:type="spellEnd"/>
-                                        <w:r>
-                                          <w:rPr>
-                                            <w:rFonts w:ascii="Trebuchet MS" w:hAnsi="Trebuchet MS"/>
-                                            <w:b/>
-                                            <w:color w:val="000000" w:themeColor="text1"/>
-                                            <w:sz w:val="20"/>
-                                          </w:rPr>
-                                          <w:t xml:space="preserve"> School in Israel</w:t>
+                                          <w:t>Annual Meeting of the Multimessenger School in Israel</w:t>
                                         </w:r>
                                       </w:p>
                                       <w:p>
@@ -17603,27 +16445,7 @@
                                       <w:color w:val="000000" w:themeColor="text1"/>
                                       <w:sz w:val="20"/>
                                     </w:rPr>
-                                    <w:t xml:space="preserve">Annual Meeting of the </w:t>
-                                  </w:r>
-                                  <w:proofErr w:type="spellStart"/>
-                                  <w:r>
-                                    <w:rPr>
-                                      <w:rFonts w:ascii="Trebuchet MS" w:hAnsi="Trebuchet MS"/>
-                                      <w:b/>
-                                      <w:color w:val="000000" w:themeColor="text1"/>
-                                      <w:sz w:val="20"/>
-                                    </w:rPr>
-                                    <w:t>Multimessenger</w:t>
-                                  </w:r>
-                                  <w:proofErr w:type="spellEnd"/>
-                                  <w:r>
-                                    <w:rPr>
-                                      <w:rFonts w:ascii="Trebuchet MS" w:hAnsi="Trebuchet MS"/>
-                                      <w:b/>
-                                      <w:color w:val="000000" w:themeColor="text1"/>
-                                      <w:sz w:val="20"/>
-                                    </w:rPr>
-                                    <w:t xml:space="preserve"> School in Israel</w:t>
+                                    <w:t>Annual Meeting of the Multimessenger School in Israel</w:t>
                                   </w:r>
                                 </w:p>
                                 <w:p>
@@ -17841,27 +16663,7 @@
                                             <w:color w:val="000000" w:themeColor="text1"/>
                                             <w:sz w:val="20"/>
                                           </w:rPr>
-                                          <w:t xml:space="preserve">7th Meeting of the </w:t>
-                                        </w:r>
-                                        <w:proofErr w:type="spellStart"/>
-                                        <w:r>
-                                          <w:rPr>
-                                            <w:rFonts w:ascii="Trebuchet MS" w:hAnsi="Trebuchet MS"/>
-                                            <w:b/>
-                                            <w:color w:val="000000" w:themeColor="text1"/>
-                                            <w:sz w:val="20"/>
-                                          </w:rPr>
-                                          <w:t>Astroparticle</w:t>
-                                        </w:r>
-                                        <w:proofErr w:type="spellEnd"/>
-                                        <w:r>
-                                          <w:rPr>
-                                            <w:rFonts w:ascii="Trebuchet MS" w:hAnsi="Trebuchet MS"/>
-                                            <w:b/>
-                                            <w:color w:val="000000" w:themeColor="text1"/>
-                                            <w:sz w:val="20"/>
-                                          </w:rPr>
-                                          <w:t xml:space="preserve"> Physics Committee</w:t>
+                                          <w:t>7th Meeting of the Astroparticle Physics Committee</w:t>
                                         </w:r>
                                         <w:r>
                                           <w:rPr>
@@ -18020,27 +16822,7 @@
                                       <w:color w:val="000000" w:themeColor="text1"/>
                                       <w:sz w:val="20"/>
                                     </w:rPr>
-                                    <w:t xml:space="preserve">7th Meeting of the </w:t>
-                                  </w:r>
-                                  <w:proofErr w:type="spellStart"/>
-                                  <w:r>
-                                    <w:rPr>
-                                      <w:rFonts w:ascii="Trebuchet MS" w:hAnsi="Trebuchet MS"/>
-                                      <w:b/>
-                                      <w:color w:val="000000" w:themeColor="text1"/>
-                                      <w:sz w:val="20"/>
-                                    </w:rPr>
-                                    <w:t>Astroparticle</w:t>
-                                  </w:r>
-                                  <w:proofErr w:type="spellEnd"/>
-                                  <w:r>
-                                    <w:rPr>
-                                      <w:rFonts w:ascii="Trebuchet MS" w:hAnsi="Trebuchet MS"/>
-                                      <w:b/>
-                                      <w:color w:val="000000" w:themeColor="text1"/>
-                                      <w:sz w:val="20"/>
-                                    </w:rPr>
-                                    <w:t xml:space="preserve"> Physics Committee</w:t>
+                                    <w:t>7th Meeting of the Astroparticle Physics Committee</w:t>
                                   </w:r>
                                   <w:r>
                                     <w:rPr>
@@ -18275,7 +17057,6 @@
                                             <w:sz w:val="20"/>
                                           </w:rPr>
                                         </w:pPr>
-                                        <w:proofErr w:type="spellStart"/>
                                         <w:r>
                                           <w:rPr>
                                             <w:rFonts w:ascii="Trebuchet MS" w:hAnsi="Trebuchet MS"/>
@@ -18283,26 +17064,7 @@
                                             <w:color w:val="000000" w:themeColor="text1"/>
                                             <w:sz w:val="20"/>
                                           </w:rPr>
-                                          <w:t>Leptohadronic</w:t>
-                                        </w:r>
-                                        <w:proofErr w:type="spellEnd"/>
-                                        <w:r>
-                                          <w:rPr>
-                                            <w:rFonts w:ascii="Trebuchet MS" w:hAnsi="Trebuchet MS"/>
-                                            <w:b/>
-                                            <w:color w:val="000000" w:themeColor="text1"/>
-                                            <w:sz w:val="20"/>
-                                          </w:rPr>
-                                          <w:t xml:space="preserve"> Scenarios for TeV Extensions of Gamma-Ray Burst Afterglow Spectra</w:t>
-                                        </w:r>
-                                        <w:r>
-                                          <w:rPr>
-                                            <w:rFonts w:ascii="Trebuchet MS" w:hAnsi="Trebuchet MS"/>
-                                            <w:b/>
-                                            <w:color w:val="000000" w:themeColor="text1"/>
-                                            <w:sz w:val="20"/>
-                                          </w:rPr>
-                                          <w:t xml:space="preserve"> </w:t>
+                                          <w:t xml:space="preserve">Leptohadronic Scenarios for TeV Extensions of Gamma-Ray Burst Afterglow Spectra </w:t>
                                         </w:r>
                                       </w:p>
                                       <w:p>
@@ -18331,7 +17093,7 @@
                                             <w:sz w:val="20"/>
                                             <w:lang w:val="en-US"/>
                                           </w:rPr>
-                                          <w:t>, C Yuan, A. M. Taylor and W. Winter</w:t>
+                                          <w:t>, C</w:t>
                                         </w:r>
                                         <w:r>
                                           <w:rPr>
@@ -18340,6 +17102,24 @@
                                             <w:sz w:val="20"/>
                                             <w:lang w:val="en-US"/>
                                           </w:rPr>
+                                          <w:t>.</w:t>
+                                        </w:r>
+                                        <w:r>
+                                          <w:rPr>
+                                            <w:rFonts w:ascii="Trebuchet MS" w:hAnsi="Trebuchet MS"/>
+                                            <w:color w:val="000000" w:themeColor="text1"/>
+                                            <w:sz w:val="20"/>
+                                            <w:lang w:val="en-US"/>
+                                          </w:rPr>
+                                          <w:t xml:space="preserve"> Yuan, A. M. Taylor and W. Winter</w:t>
+                                        </w:r>
+                                        <w:r>
+                                          <w:rPr>
+                                            <w:rFonts w:ascii="Trebuchet MS" w:hAnsi="Trebuchet MS"/>
+                                            <w:color w:val="000000" w:themeColor="text1"/>
+                                            <w:sz w:val="20"/>
+                                            <w:lang w:val="en-US"/>
+                                          </w:rPr>
                                           <w:t xml:space="preserve"> </w:t>
                                         </w:r>
                                         <w:r>
@@ -18351,21 +17131,12 @@
                                           <w:t>(</w:t>
                                         </w:r>
                                         <w:hyperlink r:id="rId17" w:history="1">
-                                          <w:proofErr w:type="spellStart"/>
                                           <w:r>
                                             <w:rPr>
                                               <w:rStyle w:val="Hyperlink"/>
                                               <w:lang w:val="en-US"/>
                                             </w:rPr>
-                                            <w:t>ApJ</w:t>
-                                          </w:r>
-                                          <w:proofErr w:type="spellEnd"/>
-                                          <w:r>
-                                            <w:rPr>
-                                              <w:rStyle w:val="Hyperlink"/>
-                                              <w:lang w:val="en-US"/>
-                                            </w:rPr>
-                                            <w:t xml:space="preserve"> 977 242</w:t>
+                                            <w:t>ApJ 977 242</w:t>
                                           </w:r>
                                         </w:hyperlink>
                                         <w:r>
@@ -18486,7 +17257,6 @@
                                       <w:sz w:val="20"/>
                                     </w:rPr>
                                   </w:pPr>
-                                  <w:proofErr w:type="spellStart"/>
                                   <w:r>
                                     <w:rPr>
                                       <w:rFonts w:ascii="Trebuchet MS" w:hAnsi="Trebuchet MS"/>
@@ -18494,26 +17264,7 @@
                                       <w:color w:val="000000" w:themeColor="text1"/>
                                       <w:sz w:val="20"/>
                                     </w:rPr>
-                                    <w:t>Leptohadronic</w:t>
-                                  </w:r>
-                                  <w:proofErr w:type="spellEnd"/>
-                                  <w:r>
-                                    <w:rPr>
-                                      <w:rFonts w:ascii="Trebuchet MS" w:hAnsi="Trebuchet MS"/>
-                                      <w:b/>
-                                      <w:color w:val="000000" w:themeColor="text1"/>
-                                      <w:sz w:val="20"/>
-                                    </w:rPr>
-                                    <w:t xml:space="preserve"> Scenarios for TeV Extensions of Gamma-Ray Burst Afterglow Spectra</w:t>
-                                  </w:r>
-                                  <w:r>
-                                    <w:rPr>
-                                      <w:rFonts w:ascii="Trebuchet MS" w:hAnsi="Trebuchet MS"/>
-                                      <w:b/>
-                                      <w:color w:val="000000" w:themeColor="text1"/>
-                                      <w:sz w:val="20"/>
-                                    </w:rPr>
-                                    <w:t xml:space="preserve"> </w:t>
+                                    <w:t xml:space="preserve">Leptohadronic Scenarios for TeV Extensions of Gamma-Ray Burst Afterglow Spectra </w:t>
                                   </w:r>
                                 </w:p>
                                 <w:p>
@@ -18542,7 +17293,7 @@
                                       <w:sz w:val="20"/>
                                       <w:lang w:val="en-US"/>
                                     </w:rPr>
-                                    <w:t>, C Yuan, A. M. Taylor and W. Winter</w:t>
+                                    <w:t>, C</w:t>
                                   </w:r>
                                   <w:r>
                                     <w:rPr>
@@ -18551,6 +17302,24 @@
                                       <w:sz w:val="20"/>
                                       <w:lang w:val="en-US"/>
                                     </w:rPr>
+                                    <w:t>.</w:t>
+                                  </w:r>
+                                  <w:r>
+                                    <w:rPr>
+                                      <w:rFonts w:ascii="Trebuchet MS" w:hAnsi="Trebuchet MS"/>
+                                      <w:color w:val="000000" w:themeColor="text1"/>
+                                      <w:sz w:val="20"/>
+                                      <w:lang w:val="en-US"/>
+                                    </w:rPr>
+                                    <w:t xml:space="preserve"> Yuan, A. M. Taylor and W. Winter</w:t>
+                                  </w:r>
+                                  <w:r>
+                                    <w:rPr>
+                                      <w:rFonts w:ascii="Trebuchet MS" w:hAnsi="Trebuchet MS"/>
+                                      <w:color w:val="000000" w:themeColor="text1"/>
+                                      <w:sz w:val="20"/>
+                                      <w:lang w:val="en-US"/>
+                                    </w:rPr>
                                     <w:t xml:space="preserve"> </w:t>
                                   </w:r>
                                   <w:r>
@@ -18562,21 +17331,12 @@
                                     <w:t>(</w:t>
                                   </w:r>
                                   <w:hyperlink r:id="rId18" w:history="1">
-                                    <w:proofErr w:type="spellStart"/>
                                     <w:r>
                                       <w:rPr>
                                         <w:rStyle w:val="Hyperlink"/>
                                         <w:lang w:val="en-US"/>
                                       </w:rPr>
-                                      <w:t>ApJ</w:t>
-                                    </w:r>
-                                    <w:proofErr w:type="spellEnd"/>
-                                    <w:r>
-                                      <w:rPr>
-                                        <w:rStyle w:val="Hyperlink"/>
-                                        <w:lang w:val="en-US"/>
-                                      </w:rPr>
-                                      <w:t xml:space="preserve"> 977 242</w:t>
+                                      <w:t>ApJ 977 242</w:t>
                                     </w:r>
                                   </w:hyperlink>
                                   <w:r>
@@ -18766,27 +17526,7 @@
                                             <w:color w:val="000000" w:themeColor="text1"/>
                                             <w:sz w:val="20"/>
                                           </w:rPr>
-                                          <w:t xml:space="preserve">AM³: An open-source tool for time-dependent </w:t>
-                                        </w:r>
-                                        <w:proofErr w:type="spellStart"/>
-                                        <w:r>
-                                          <w:rPr>
-                                            <w:rFonts w:ascii="Trebuchet MS" w:hAnsi="Trebuchet MS"/>
-                                            <w:b/>
-                                            <w:color w:val="000000" w:themeColor="text1"/>
-                                            <w:sz w:val="20"/>
-                                          </w:rPr>
-                                          <w:t>lepto</w:t>
-                                        </w:r>
-                                        <w:proofErr w:type="spellEnd"/>
-                                        <w:r>
-                                          <w:rPr>
-                                            <w:rFonts w:ascii="Trebuchet MS" w:hAnsi="Trebuchet MS"/>
-                                            <w:b/>
-                                            <w:color w:val="000000" w:themeColor="text1"/>
-                                            <w:sz w:val="20"/>
-                                          </w:rPr>
-                                          <w:t xml:space="preserve">-hadronic modelling of astrophysical sources </w:t>
+                                          <w:t xml:space="preserve">AM³: An open-source tool for time-dependent lepto-hadronic modelling of astrophysical sources </w:t>
                                         </w:r>
                                       </w:p>
                                       <w:p>
@@ -18806,20 +17546,17 @@
                                             <w:sz w:val="20"/>
                                             <w:lang w:val="nl-NL"/>
                                           </w:rPr>
-                                          <w:t xml:space="preserve">M. </w:t>
-                                        </w:r>
-                                        <w:proofErr w:type="spellStart"/>
-                                        <w:r>
-                                          <w:rPr>
-                                            <w:rFonts w:ascii="Trebuchet MS" w:hAnsi="Trebuchet MS"/>
-                                            <w:b/>
+                                          <w:t>M. Klinger</w:t>
+                                        </w:r>
+                                        <w:r>
+                                          <w:rPr>
+                                            <w:rFonts w:ascii="Trebuchet MS" w:hAnsi="Trebuchet MS"/>
                                             <w:color w:val="000000" w:themeColor="text1"/>
                                             <w:sz w:val="20"/>
                                             <w:lang w:val="nl-NL"/>
                                           </w:rPr>
-                                          <w:t>Klinger</w:t>
-                                        </w:r>
-                                        <w:proofErr w:type="spellEnd"/>
+                                          <w:t xml:space="preserve">, </w:t>
+                                        </w:r>
                                         <w:r>
                                           <w:rPr>
                                             <w:rFonts w:ascii="Trebuchet MS" w:hAnsi="Trebuchet MS"/>
@@ -18827,86 +17564,48 @@
                                             <w:sz w:val="20"/>
                                             <w:lang w:val="nl-NL"/>
                                           </w:rPr>
+                                          <w:t xml:space="preserve">A. Rudolph, X. Rodrigues, </w:t>
+                                        </w:r>
+                                        <w:r>
+                                          <w:rPr>
+                                            <w:rFonts w:ascii="Trebuchet MS" w:hAnsi="Trebuchet MS"/>
+                                            <w:color w:val="000000" w:themeColor="text1"/>
+                                            <w:sz w:val="20"/>
+                                            <w:lang w:val="nl-NL"/>
+                                          </w:rPr>
+                                          <w:t xml:space="preserve">et al. </w:t>
+                                        </w:r>
+                                        <w:r>
+                                          <w:rPr>
+                                            <w:rFonts w:ascii="Trebuchet MS" w:hAnsi="Trebuchet MS"/>
+                                            <w:color w:val="595959" w:themeColor="text1" w:themeTint="A6"/>
+                                            <w:sz w:val="20"/>
+                                          </w:rPr>
+                                          <w:t>(s</w:t>
+                                        </w:r>
+                                        <w:r>
+                                          <w:rPr>
+                                            <w:rFonts w:ascii="Trebuchet MS" w:hAnsi="Trebuchet MS"/>
+                                            <w:color w:val="595959" w:themeColor="text1" w:themeTint="A6"/>
+                                            <w:sz w:val="20"/>
+                                          </w:rPr>
+                                          <w:t>oftware</w:t>
+                                        </w:r>
+                                        <w:r>
+                                          <w:rPr>
+                                            <w:rFonts w:ascii="Trebuchet MS" w:hAnsi="Trebuchet MS"/>
+                                            <w:color w:val="595959" w:themeColor="text1" w:themeTint="A6"/>
+                                            <w:sz w:val="20"/>
+                                          </w:rPr>
                                           <w:t xml:space="preserve">, </w:t>
                                         </w:r>
-                                        <w:r>
-                                          <w:rPr>
-                                            <w:rFonts w:ascii="Trebuchet MS" w:hAnsi="Trebuchet MS"/>
-                                            <w:color w:val="000000" w:themeColor="text1"/>
-                                            <w:sz w:val="20"/>
-                                            <w:lang w:val="nl-NL"/>
-                                          </w:rPr>
-                                          <w:t xml:space="preserve">A. Rudolph, X. </w:t>
-                                        </w:r>
-                                        <w:proofErr w:type="spellStart"/>
-                                        <w:r>
-                                          <w:rPr>
-                                            <w:rFonts w:ascii="Trebuchet MS" w:hAnsi="Trebuchet MS"/>
-                                            <w:color w:val="000000" w:themeColor="text1"/>
-                                            <w:sz w:val="20"/>
-                                            <w:lang w:val="nl-NL"/>
-                                          </w:rPr>
-                                          <w:t>Rodrigues</w:t>
-                                        </w:r>
-                                        <w:proofErr w:type="spellEnd"/>
-                                        <w:r>
-                                          <w:rPr>
-                                            <w:rFonts w:ascii="Trebuchet MS" w:hAnsi="Trebuchet MS"/>
-                                            <w:color w:val="000000" w:themeColor="text1"/>
-                                            <w:sz w:val="20"/>
-                                            <w:lang w:val="nl-NL"/>
-                                          </w:rPr>
-                                          <w:t xml:space="preserve">, </w:t>
-                                        </w:r>
-                                        <w:r>
-                                          <w:rPr>
-                                            <w:rFonts w:ascii="Trebuchet MS" w:hAnsi="Trebuchet MS"/>
-                                            <w:color w:val="000000" w:themeColor="text1"/>
-                                            <w:sz w:val="20"/>
-                                            <w:lang w:val="nl-NL"/>
-                                          </w:rPr>
-                                          <w:t xml:space="preserve">et al. </w:t>
-                                        </w:r>
-                                        <w:r>
-                                          <w:rPr>
-                                            <w:rFonts w:ascii="Trebuchet MS" w:hAnsi="Trebuchet MS"/>
-                                            <w:color w:val="595959" w:themeColor="text1" w:themeTint="A6"/>
-                                            <w:sz w:val="20"/>
-                                          </w:rPr>
-                                          <w:t>(s</w:t>
-                                        </w:r>
-                                        <w:r>
-                                          <w:rPr>
-                                            <w:rFonts w:ascii="Trebuchet MS" w:hAnsi="Trebuchet MS"/>
-                                            <w:color w:val="595959" w:themeColor="text1" w:themeTint="A6"/>
-                                            <w:sz w:val="20"/>
-                                          </w:rPr>
-                                          <w:t>oftware</w:t>
-                                        </w:r>
-                                        <w:r>
-                                          <w:rPr>
-                                            <w:rFonts w:ascii="Trebuchet MS" w:hAnsi="Trebuchet MS"/>
-                                            <w:color w:val="595959" w:themeColor="text1" w:themeTint="A6"/>
-                                            <w:sz w:val="20"/>
-                                          </w:rPr>
-                                          <w:t xml:space="preserve">, </w:t>
-                                        </w:r>
                                         <w:hyperlink r:id="rId19" w:history="1">
-                                          <w:proofErr w:type="spellStart"/>
                                           <w:r>
                                             <w:rPr>
                                               <w:rStyle w:val="Hyperlink"/>
                                               <w:lang w:val="en-US"/>
                                             </w:rPr>
-                                            <w:t>ApJS</w:t>
-                                          </w:r>
-                                          <w:proofErr w:type="spellEnd"/>
-                                          <w:r>
-                                            <w:rPr>
-                                              <w:rStyle w:val="Hyperlink"/>
-                                              <w:lang w:val="en-US"/>
-                                            </w:rPr>
-                                            <w:t xml:space="preserve"> 275 4</w:t>
+                                            <w:t>ApJS 275 4</w:t>
                                           </w:r>
                                         </w:hyperlink>
                                         <w:r>
@@ -19025,27 +17724,7 @@
                                       <w:color w:val="000000" w:themeColor="text1"/>
                                       <w:sz w:val="20"/>
                                     </w:rPr>
-                                    <w:t xml:space="preserve">AM³: An open-source tool for time-dependent </w:t>
-                                  </w:r>
-                                  <w:proofErr w:type="spellStart"/>
-                                  <w:r>
-                                    <w:rPr>
-                                      <w:rFonts w:ascii="Trebuchet MS" w:hAnsi="Trebuchet MS"/>
-                                      <w:b/>
-                                      <w:color w:val="000000" w:themeColor="text1"/>
-                                      <w:sz w:val="20"/>
-                                    </w:rPr>
-                                    <w:t>lepto</w:t>
-                                  </w:r>
-                                  <w:proofErr w:type="spellEnd"/>
-                                  <w:r>
-                                    <w:rPr>
-                                      <w:rFonts w:ascii="Trebuchet MS" w:hAnsi="Trebuchet MS"/>
-                                      <w:b/>
-                                      <w:color w:val="000000" w:themeColor="text1"/>
-                                      <w:sz w:val="20"/>
-                                    </w:rPr>
-                                    <w:t xml:space="preserve">-hadronic modelling of astrophysical sources </w:t>
+                                    <w:t xml:space="preserve">AM³: An open-source tool for time-dependent lepto-hadronic modelling of astrophysical sources </w:t>
                                   </w:r>
                                 </w:p>
                                 <w:p>
@@ -19065,20 +17744,17 @@
                                       <w:sz w:val="20"/>
                                       <w:lang w:val="nl-NL"/>
                                     </w:rPr>
-                                    <w:t xml:space="preserve">M. </w:t>
-                                  </w:r>
-                                  <w:proofErr w:type="spellStart"/>
-                                  <w:r>
-                                    <w:rPr>
-                                      <w:rFonts w:ascii="Trebuchet MS" w:hAnsi="Trebuchet MS"/>
-                                      <w:b/>
+                                    <w:t>M. Klinger</w:t>
+                                  </w:r>
+                                  <w:r>
+                                    <w:rPr>
+                                      <w:rFonts w:ascii="Trebuchet MS" w:hAnsi="Trebuchet MS"/>
                                       <w:color w:val="000000" w:themeColor="text1"/>
                                       <w:sz w:val="20"/>
                                       <w:lang w:val="nl-NL"/>
                                     </w:rPr>
-                                    <w:t>Klinger</w:t>
-                                  </w:r>
-                                  <w:proofErr w:type="spellEnd"/>
+                                    <w:t xml:space="preserve">, </w:t>
+                                  </w:r>
                                   <w:r>
                                     <w:rPr>
                                       <w:rFonts w:ascii="Trebuchet MS" w:hAnsi="Trebuchet MS"/>
@@ -19086,86 +17762,48 @@
                                       <w:sz w:val="20"/>
                                       <w:lang w:val="nl-NL"/>
                                     </w:rPr>
+                                    <w:t xml:space="preserve">A. Rudolph, X. Rodrigues, </w:t>
+                                  </w:r>
+                                  <w:r>
+                                    <w:rPr>
+                                      <w:rFonts w:ascii="Trebuchet MS" w:hAnsi="Trebuchet MS"/>
+                                      <w:color w:val="000000" w:themeColor="text1"/>
+                                      <w:sz w:val="20"/>
+                                      <w:lang w:val="nl-NL"/>
+                                    </w:rPr>
+                                    <w:t xml:space="preserve">et al. </w:t>
+                                  </w:r>
+                                  <w:r>
+                                    <w:rPr>
+                                      <w:rFonts w:ascii="Trebuchet MS" w:hAnsi="Trebuchet MS"/>
+                                      <w:color w:val="595959" w:themeColor="text1" w:themeTint="A6"/>
+                                      <w:sz w:val="20"/>
+                                    </w:rPr>
+                                    <w:t>(s</w:t>
+                                  </w:r>
+                                  <w:r>
+                                    <w:rPr>
+                                      <w:rFonts w:ascii="Trebuchet MS" w:hAnsi="Trebuchet MS"/>
+                                      <w:color w:val="595959" w:themeColor="text1" w:themeTint="A6"/>
+                                      <w:sz w:val="20"/>
+                                    </w:rPr>
+                                    <w:t>oftware</w:t>
+                                  </w:r>
+                                  <w:r>
+                                    <w:rPr>
+                                      <w:rFonts w:ascii="Trebuchet MS" w:hAnsi="Trebuchet MS"/>
+                                      <w:color w:val="595959" w:themeColor="text1" w:themeTint="A6"/>
+                                      <w:sz w:val="20"/>
+                                    </w:rPr>
                                     <w:t xml:space="preserve">, </w:t>
                                   </w:r>
-                                  <w:r>
-                                    <w:rPr>
-                                      <w:rFonts w:ascii="Trebuchet MS" w:hAnsi="Trebuchet MS"/>
-                                      <w:color w:val="000000" w:themeColor="text1"/>
-                                      <w:sz w:val="20"/>
-                                      <w:lang w:val="nl-NL"/>
-                                    </w:rPr>
-                                    <w:t xml:space="preserve">A. Rudolph, X. </w:t>
-                                  </w:r>
-                                  <w:proofErr w:type="spellStart"/>
-                                  <w:r>
-                                    <w:rPr>
-                                      <w:rFonts w:ascii="Trebuchet MS" w:hAnsi="Trebuchet MS"/>
-                                      <w:color w:val="000000" w:themeColor="text1"/>
-                                      <w:sz w:val="20"/>
-                                      <w:lang w:val="nl-NL"/>
-                                    </w:rPr>
-                                    <w:t>Rodrigues</w:t>
-                                  </w:r>
-                                  <w:proofErr w:type="spellEnd"/>
-                                  <w:r>
-                                    <w:rPr>
-                                      <w:rFonts w:ascii="Trebuchet MS" w:hAnsi="Trebuchet MS"/>
-                                      <w:color w:val="000000" w:themeColor="text1"/>
-                                      <w:sz w:val="20"/>
-                                      <w:lang w:val="nl-NL"/>
-                                    </w:rPr>
-                                    <w:t xml:space="preserve">, </w:t>
-                                  </w:r>
-                                  <w:r>
-                                    <w:rPr>
-                                      <w:rFonts w:ascii="Trebuchet MS" w:hAnsi="Trebuchet MS"/>
-                                      <w:color w:val="000000" w:themeColor="text1"/>
-                                      <w:sz w:val="20"/>
-                                      <w:lang w:val="nl-NL"/>
-                                    </w:rPr>
-                                    <w:t xml:space="preserve">et al. </w:t>
-                                  </w:r>
-                                  <w:r>
-                                    <w:rPr>
-                                      <w:rFonts w:ascii="Trebuchet MS" w:hAnsi="Trebuchet MS"/>
-                                      <w:color w:val="595959" w:themeColor="text1" w:themeTint="A6"/>
-                                      <w:sz w:val="20"/>
-                                    </w:rPr>
-                                    <w:t>(s</w:t>
-                                  </w:r>
-                                  <w:r>
-                                    <w:rPr>
-                                      <w:rFonts w:ascii="Trebuchet MS" w:hAnsi="Trebuchet MS"/>
-                                      <w:color w:val="595959" w:themeColor="text1" w:themeTint="A6"/>
-                                      <w:sz w:val="20"/>
-                                    </w:rPr>
-                                    <w:t>oftware</w:t>
-                                  </w:r>
-                                  <w:r>
-                                    <w:rPr>
-                                      <w:rFonts w:ascii="Trebuchet MS" w:hAnsi="Trebuchet MS"/>
-                                      <w:color w:val="595959" w:themeColor="text1" w:themeTint="A6"/>
-                                      <w:sz w:val="20"/>
-                                    </w:rPr>
-                                    <w:t xml:space="preserve">, </w:t>
-                                  </w:r>
                                   <w:hyperlink r:id="rId20" w:history="1">
-                                    <w:proofErr w:type="spellStart"/>
                                     <w:r>
                                       <w:rPr>
                                         <w:rStyle w:val="Hyperlink"/>
                                         <w:lang w:val="en-US"/>
                                       </w:rPr>
-                                      <w:t>ApJS</w:t>
-                                    </w:r>
-                                    <w:proofErr w:type="spellEnd"/>
-                                    <w:r>
-                                      <w:rPr>
-                                        <w:rStyle w:val="Hyperlink"/>
-                                        <w:lang w:val="en-US"/>
-                                      </w:rPr>
-                                      <w:t xml:space="preserve"> 275 4</w:t>
+                                      <w:t>ApJS 275 4</w:t>
                                     </w:r>
                                   </w:hyperlink>
                                   <w:r>
@@ -19368,48 +18006,16 @@
                                             <w:sz w:val="20"/>
                                             <w:lang w:val="nl-NL"/>
                                           </w:rPr>
-                                          <w:t xml:space="preserve">M. </w:t>
-                                        </w:r>
-                                        <w:proofErr w:type="spellStart"/>
-                                        <w:r>
-                                          <w:rPr>
-                                            <w:rFonts w:ascii="Trebuchet MS" w:hAnsi="Trebuchet MS"/>
-                                            <w:b/>
+                                          <w:t>M. Klinger</w:t>
+                                        </w:r>
+                                        <w:r>
+                                          <w:rPr>
+                                            <w:rFonts w:ascii="Trebuchet MS" w:hAnsi="Trebuchet MS"/>
                                             <w:color w:val="000000" w:themeColor="text1"/>
                                             <w:sz w:val="20"/>
                                             <w:lang w:val="nl-NL"/>
                                           </w:rPr>
-                                          <w:t>Klinger</w:t>
-                                        </w:r>
-                                        <w:proofErr w:type="spellEnd"/>
-                                        <w:r>
-                                          <w:rPr>
-                                            <w:rFonts w:ascii="Trebuchet MS" w:hAnsi="Trebuchet MS"/>
-                                            <w:color w:val="000000" w:themeColor="text1"/>
-                                            <w:sz w:val="20"/>
-                                            <w:lang w:val="nl-NL"/>
-                                          </w:rPr>
-                                          <w:t xml:space="preserve">, A. M. Taylor, T. </w:t>
-                                        </w:r>
-                                        <w:proofErr w:type="spellStart"/>
-                                        <w:r>
-                                          <w:rPr>
-                                            <w:rFonts w:ascii="Trebuchet MS" w:hAnsi="Trebuchet MS"/>
-                                            <w:color w:val="000000" w:themeColor="text1"/>
-                                            <w:sz w:val="20"/>
-                                            <w:lang w:val="nl-NL"/>
-                                          </w:rPr>
-                                          <w:t>Parsotan</w:t>
-                                        </w:r>
-                                        <w:proofErr w:type="spellEnd"/>
-                                        <w:r>
-                                          <w:rPr>
-                                            <w:rFonts w:ascii="Trebuchet MS" w:hAnsi="Trebuchet MS"/>
-                                            <w:color w:val="000000" w:themeColor="text1"/>
-                                            <w:sz w:val="20"/>
-                                            <w:lang w:val="nl-NL"/>
-                                          </w:rPr>
-                                          <w:t xml:space="preserve">, et al. </w:t>
+                                          <w:t xml:space="preserve">, A. M. Taylor, T. Parsotan, et al. </w:t>
                                         </w:r>
                                         <w:r>
                                           <w:rPr>
@@ -19569,48 +18175,16 @@
                                       <w:sz w:val="20"/>
                                       <w:lang w:val="nl-NL"/>
                                     </w:rPr>
-                                    <w:t xml:space="preserve">M. </w:t>
-                                  </w:r>
-                                  <w:proofErr w:type="spellStart"/>
-                                  <w:r>
-                                    <w:rPr>
-                                      <w:rFonts w:ascii="Trebuchet MS" w:hAnsi="Trebuchet MS"/>
-                                      <w:b/>
+                                    <w:t>M. Klinger</w:t>
+                                  </w:r>
+                                  <w:r>
+                                    <w:rPr>
+                                      <w:rFonts w:ascii="Trebuchet MS" w:hAnsi="Trebuchet MS"/>
                                       <w:color w:val="000000" w:themeColor="text1"/>
                                       <w:sz w:val="20"/>
                                       <w:lang w:val="nl-NL"/>
                                     </w:rPr>
-                                    <w:t>Klinger</w:t>
-                                  </w:r>
-                                  <w:proofErr w:type="spellEnd"/>
-                                  <w:r>
-                                    <w:rPr>
-                                      <w:rFonts w:ascii="Trebuchet MS" w:hAnsi="Trebuchet MS"/>
-                                      <w:color w:val="000000" w:themeColor="text1"/>
-                                      <w:sz w:val="20"/>
-                                      <w:lang w:val="nl-NL"/>
-                                    </w:rPr>
-                                    <w:t xml:space="preserve">, A. M. Taylor, T. </w:t>
-                                  </w:r>
-                                  <w:proofErr w:type="spellStart"/>
-                                  <w:r>
-                                    <w:rPr>
-                                      <w:rFonts w:ascii="Trebuchet MS" w:hAnsi="Trebuchet MS"/>
-                                      <w:color w:val="000000" w:themeColor="text1"/>
-                                      <w:sz w:val="20"/>
-                                      <w:lang w:val="nl-NL"/>
-                                    </w:rPr>
-                                    <w:t>Parsotan</w:t>
-                                  </w:r>
-                                  <w:proofErr w:type="spellEnd"/>
-                                  <w:r>
-                                    <w:rPr>
-                                      <w:rFonts w:ascii="Trebuchet MS" w:hAnsi="Trebuchet MS"/>
-                                      <w:color w:val="000000" w:themeColor="text1"/>
-                                      <w:sz w:val="20"/>
-                                      <w:lang w:val="nl-NL"/>
-                                    </w:rPr>
-                                    <w:t xml:space="preserve">, et al. </w:t>
+                                    <w:t xml:space="preserve">, A. M. Taylor, T. Parsotan, et al. </w:t>
                                   </w:r>
                                   <w:r>
                                     <w:rPr>
@@ -20218,9 +18792,8 @@
                                             <w:sz w:val="20"/>
                                             <w:lang w:val="en-US"/>
                                           </w:rPr>
-                                          <w:t xml:space="preserve">, M. Beck and F. </w:t>
-                                        </w:r>
-                                        <w:proofErr w:type="spellStart"/>
+                                          <w:t>, M. Beck and F. Theißen on behalf of the FACT collaboration</w:t>
+                                        </w:r>
                                         <w:r>
                                           <w:rPr>
                                             <w:rFonts w:ascii="Trebuchet MS" w:hAnsi="Trebuchet MS"/>
@@ -20228,29 +18801,9 @@
                                             <w:sz w:val="20"/>
                                             <w:lang w:val="en-US"/>
                                           </w:rPr>
-                                          <w:t>Theißen</w:t>
-                                        </w:r>
-                                        <w:proofErr w:type="spellEnd"/>
-                                        <w:r>
-                                          <w:rPr>
-                                            <w:rFonts w:ascii="Trebuchet MS" w:hAnsi="Trebuchet MS"/>
-                                            <w:color w:val="000000" w:themeColor="text1"/>
-                                            <w:sz w:val="20"/>
-                                            <w:lang w:val="en-US"/>
-                                          </w:rPr>
-                                          <w:t xml:space="preserve"> on behalf of the FACT collaboration</w:t>
-                                        </w:r>
-                                        <w:r>
-                                          <w:rPr>
-                                            <w:rFonts w:ascii="Trebuchet MS" w:hAnsi="Trebuchet MS"/>
-                                            <w:color w:val="000000" w:themeColor="text1"/>
-                                            <w:sz w:val="20"/>
-                                            <w:lang w:val="en-US"/>
-                                          </w:rPr>
                                           <w:t xml:space="preserve"> </w:t>
                                         </w:r>
                                         <w:hyperlink r:id="rId25" w:history="1">
-                                          <w:proofErr w:type="spellStart"/>
                                           <w:proofErr w:type="gramStart"/>
                                           <w:r>
                                             <w:rPr>
@@ -20258,16 +18811,7 @@
                                               <w:rFonts w:ascii="Trebuchet MS" w:hAnsi="Trebuchet MS"/>
                                               <w:sz w:val="20"/>
                                             </w:rPr>
-                                            <w:t>PoS</w:t>
-                                          </w:r>
-                                          <w:proofErr w:type="spellEnd"/>
-                                          <w:r>
-                                            <w:rPr>
-                                              <w:rStyle w:val="Hyperlink"/>
-                                              <w:rFonts w:ascii="Trebuchet MS" w:hAnsi="Trebuchet MS"/>
-                                              <w:sz w:val="20"/>
-                                            </w:rPr>
-                                            <w:t>(</w:t>
+                                            <w:t>PoS(</w:t>
                                           </w:r>
                                           <w:proofErr w:type="gramEnd"/>
                                           <w:r>
@@ -20409,9 +18953,8 @@
                                       <w:sz w:val="20"/>
                                       <w:lang w:val="en-US"/>
                                     </w:rPr>
-                                    <w:t xml:space="preserve">, M. Beck and F. </w:t>
-                                  </w:r>
-                                  <w:proofErr w:type="spellStart"/>
+                                    <w:t>, M. Beck and F. Theißen on behalf of the FACT collaboration</w:t>
+                                  </w:r>
                                   <w:r>
                                     <w:rPr>
                                       <w:rFonts w:ascii="Trebuchet MS" w:hAnsi="Trebuchet MS"/>
@@ -20419,29 +18962,9 @@
                                       <w:sz w:val="20"/>
                                       <w:lang w:val="en-US"/>
                                     </w:rPr>
-                                    <w:t>Theißen</w:t>
-                                  </w:r>
-                                  <w:proofErr w:type="spellEnd"/>
-                                  <w:r>
-                                    <w:rPr>
-                                      <w:rFonts w:ascii="Trebuchet MS" w:hAnsi="Trebuchet MS"/>
-                                      <w:color w:val="000000" w:themeColor="text1"/>
-                                      <w:sz w:val="20"/>
-                                      <w:lang w:val="en-US"/>
-                                    </w:rPr>
-                                    <w:t xml:space="preserve"> on behalf of the FACT collaboration</w:t>
-                                  </w:r>
-                                  <w:r>
-                                    <w:rPr>
-                                      <w:rFonts w:ascii="Trebuchet MS" w:hAnsi="Trebuchet MS"/>
-                                      <w:color w:val="000000" w:themeColor="text1"/>
-                                      <w:sz w:val="20"/>
-                                      <w:lang w:val="en-US"/>
-                                    </w:rPr>
                                     <w:t xml:space="preserve"> </w:t>
                                   </w:r>
                                   <w:hyperlink r:id="rId26" w:history="1">
-                                    <w:proofErr w:type="spellStart"/>
                                     <w:proofErr w:type="gramStart"/>
                                     <w:r>
                                       <w:rPr>
@@ -20449,16 +18972,7 @@
                                         <w:rFonts w:ascii="Trebuchet MS" w:hAnsi="Trebuchet MS"/>
                                         <w:sz w:val="20"/>
                                       </w:rPr>
-                                      <w:t>PoS</w:t>
-                                    </w:r>
-                                    <w:proofErr w:type="spellEnd"/>
-                                    <w:r>
-                                      <w:rPr>
-                                        <w:rStyle w:val="Hyperlink"/>
-                                        <w:rFonts w:ascii="Trebuchet MS" w:hAnsi="Trebuchet MS"/>
-                                        <w:sz w:val="20"/>
-                                      </w:rPr>
-                                      <w:t>(</w:t>
+                                      <w:t>PoS(</w:t>
                                     </w:r>
                                     <w:proofErr w:type="gramEnd"/>
                                     <w:r>
@@ -20699,7 +19213,6 @@
                                           <w:t xml:space="preserve"> </w:t>
                                         </w:r>
                                         <w:hyperlink r:id="rId27" w:history="1">
-                                          <w:proofErr w:type="spellStart"/>
                                           <w:proofErr w:type="gramStart"/>
                                           <w:r>
                                             <w:rPr>
@@ -20707,16 +19220,7 @@
                                               <w:rFonts w:ascii="Trebuchet MS" w:hAnsi="Trebuchet MS"/>
                                               <w:sz w:val="20"/>
                                             </w:rPr>
-                                            <w:t>PoS</w:t>
-                                          </w:r>
-                                          <w:proofErr w:type="spellEnd"/>
-                                          <w:r>
-                                            <w:rPr>
-                                              <w:rStyle w:val="Hyperlink"/>
-                                              <w:rFonts w:ascii="Trebuchet MS" w:hAnsi="Trebuchet MS"/>
-                                              <w:sz w:val="20"/>
-                                            </w:rPr>
-                                            <w:t>(</w:t>
+                                            <w:t>PoS(</w:t>
                                           </w:r>
                                           <w:proofErr w:type="gramEnd"/>
                                           <w:r>
@@ -20895,7 +19399,6 @@
                                     <w:t xml:space="preserve"> </w:t>
                                   </w:r>
                                   <w:hyperlink r:id="rId28" w:history="1">
-                                    <w:proofErr w:type="spellStart"/>
                                     <w:proofErr w:type="gramStart"/>
                                     <w:r>
                                       <w:rPr>
@@ -20903,16 +19406,7 @@
                                         <w:rFonts w:ascii="Trebuchet MS" w:hAnsi="Trebuchet MS"/>
                                         <w:sz w:val="20"/>
                                       </w:rPr>
-                                      <w:t>PoS</w:t>
-                                    </w:r>
-                                    <w:proofErr w:type="spellEnd"/>
-                                    <w:r>
-                                      <w:rPr>
-                                        <w:rStyle w:val="Hyperlink"/>
-                                        <w:rFonts w:ascii="Trebuchet MS" w:hAnsi="Trebuchet MS"/>
-                                        <w:sz w:val="20"/>
-                                      </w:rPr>
-                                      <w:t>(</w:t>
+                                      <w:t>PoS(</w:t>
                                     </w:r>
                                     <w:proofErr w:type="gramEnd"/>
                                     <w:r>

</xml_diff>